<commit_message>
Sync D7 docs for restore fix
</commit_message>
<xml_diff>
--- a/Project_Docs_D7/Backlog_Known_Issues_Roadmap.docx
+++ b/Project_Docs_D7/Backlog_Known_Issues_Roadmap.docx
@@ -2,15 +2,14 @@
 <file path=word/document.xml><?xml version="1.0" encoding="utf-8"?>
 <w:document xmlns:w="http://schemas.openxmlformats.org/wordprocessingml/2006/main" xmlns:m="http://schemas.openxmlformats.org/officeDocument/2006/math" xmlns:r="http://schemas.openxmlformats.org/officeDocument/2006/relationships" xmlns:o="urn:schemas-microsoft-com:office:office" xmlns:v="urn:schemas-microsoft-com:vml" xmlns:w10="urn:schemas-microsoft-com:office:word" xmlns:a="http://schemas.openxmlformats.org/drawingml/2006/main" xmlns:pic="http://schemas.openxmlformats.org/drawingml/2006/picture" xmlns:wp="http://schemas.openxmlformats.org/drawingml/2006/wordprocessingDrawing">
   <w:body>
+    <w:bookmarkStart w:id="17" w:name="backlog-known-issues-and-roadmap"/>
     <w:p>
       <w:pPr>
         <w:pStyle w:val="Heading1"/>
       </w:pPr>
-      <w:bookmarkStart w:id="20" w:name="backlog-known-issues-and-roadmap"/>
       <w:r>
         <w:t xml:space="preserve">Backlog, Known Issues, and Roadmap</w:t>
       </w:r>
-      <w:bookmarkEnd w:id="20"/>
     </w:p>
     <w:p>
       <w:pPr>
@@ -19,6 +18,7 @@
       <w:r>
         <w:rPr>
           <w:b/>
+          <w:bCs/>
         </w:rPr>
         <w:t xml:space="preserve">Status date:</w:t>
       </w:r>
@@ -37,44 +37,36 @@
         <w:t xml:space="preserve">This is the prioritized list of remaining work, framed for the next developer or maintenance team. Items are grouped by priority and each has a "Why it matters" and a "Suggested next step" so the work can be picked up without re-deriving context.</w:t>
       </w:r>
     </w:p>
+    <w:bookmarkStart w:id="10" w:name="X6f14b7dc424f020c875efa54542accb161b71f8"/>
     <w:p>
       <w:pPr>
         <w:pStyle w:val="Heading2"/>
       </w:pPr>
-      <w:bookmarkStart w:id="21" w:name="X6f14b7dc424f020c875efa54542accb161b71f8"/>
       <w:r>
         <w:t xml:space="preserve">Priority 0 — Handoff blockers (must close before sign-off)</w:t>
       </w:r>
-      <w:bookmarkEnd w:id="21"/>
     </w:p>
     <w:tbl>
       <w:tblPr>
         <w:tblStyle w:val="Table"/>
-        <w:tblW w:type="pct" w:w="0.0"/>
-        <w:tblLook w:firstRow="1"/>
+        <w:tblW w:type="auto" w:w="0"/>
+        <w:tblLook w:firstRow="1" w:lastRow="0" w:firstColumn="0" w:lastColumn="0" w:noHBand="0" w:noVBand="0" w:val="0020"/>
       </w:tblPr>
       <w:tblGrid>
-        <w:gridCol w:w="2340"/>
-        <w:gridCol w:w="2340"/>
-        <w:gridCol w:w="2340"/>
-        <w:gridCol w:w="2340"/>
+        <w:gridCol w:w="1980"/>
+        <w:gridCol w:w="1980"/>
+        <w:gridCol w:w="1980"/>
+        <w:gridCol w:w="1980"/>
       </w:tblGrid>
-      <w:tblGrid/>
       <w:tr>
         <w:trPr>
-          <w:cnfStyle w:firstRow="1"/>
+          <w:tblHeader w:val="on"/>
         </w:trPr>
         <w:tc>
-          <w:tcPr>
-            <w:tcBorders>
-              <w:bottom w:val="single"/>
-            </w:tcBorders>
-            <w:vAlign w:val="bottom"/>
-          </w:tcPr>
-          <w:p>
-            <w:pPr>
-              <w:pStyle w:val="Compact"/>
-              <w:jc w:val="left"/>
+          <w:tcPr/>
+          <w:p>
+            <w:pPr>
+              <w:pStyle w:val="Compact"/>
             </w:pPr>
             <w:r>
               <w:t xml:space="preserve">Item</w:t>
@@ -82,16 +74,10 @@
           </w:p>
         </w:tc>
         <w:tc>
-          <w:tcPr>
-            <w:tcBorders>
-              <w:bottom w:val="single"/>
-            </w:tcBorders>
-            <w:vAlign w:val="bottom"/>
-          </w:tcPr>
-          <w:p>
-            <w:pPr>
-              <w:pStyle w:val="Compact"/>
-              <w:jc w:val="left"/>
+          <w:tcPr/>
+          <w:p>
+            <w:pPr>
+              <w:pStyle w:val="Compact"/>
             </w:pPr>
             <w:r>
               <w:t xml:space="preserve">Status</w:t>
@@ -99,16 +85,10 @@
           </w:p>
         </w:tc>
         <w:tc>
-          <w:tcPr>
-            <w:tcBorders>
-              <w:bottom w:val="single"/>
-            </w:tcBorders>
-            <w:vAlign w:val="bottom"/>
-          </w:tcPr>
-          <w:p>
-            <w:pPr>
-              <w:pStyle w:val="Compact"/>
-              <w:jc w:val="left"/>
+          <w:tcPr/>
+          <w:p>
+            <w:pPr>
+              <w:pStyle w:val="Compact"/>
             </w:pPr>
             <w:r>
               <w:t xml:space="preserve">Owner</w:t>
@@ -116,16 +96,10 @@
           </w:p>
         </w:tc>
         <w:tc>
-          <w:tcPr>
-            <w:tcBorders>
-              <w:bottom w:val="single"/>
-            </w:tcBorders>
-            <w:vAlign w:val="bottom"/>
-          </w:tcPr>
-          <w:p>
-            <w:pPr>
-              <w:pStyle w:val="Compact"/>
-              <w:jc w:val="left"/>
+          <w:tcPr/>
+          <w:p>
+            <w:pPr>
+              <w:pStyle w:val="Compact"/>
             </w:pPr>
             <w:r>
               <w:t xml:space="preserve">Next step</w:t>
@@ -135,10 +109,10 @@
       </w:tr>
       <w:tr>
         <w:tc>
-          <w:p>
-            <w:pPr>
-              <w:pStyle w:val="Compact"/>
-              <w:jc w:val="left"/>
+          <w:tcPr/>
+          <w:p>
+            <w:pPr>
+              <w:pStyle w:val="Compact"/>
             </w:pPr>
             <w:r>
               <w:t xml:space="preserve">Stakeholder Owner/Admin on</w:t>
@@ -155,10 +129,10 @@
           </w:p>
         </w:tc>
         <w:tc>
-          <w:p>
-            <w:pPr>
-              <w:pStyle w:val="Compact"/>
-              <w:jc w:val="left"/>
+          <w:tcPr/>
+          <w:p>
+            <w:pPr>
+              <w:pStyle w:val="Compact"/>
             </w:pPr>
             <w:r>
               <w:t xml:space="preserve">Pending</w:t>
@@ -166,10 +140,10 @@
           </w:p>
         </w:tc>
         <w:tc>
-          <w:p>
-            <w:pPr>
-              <w:pStyle w:val="Compact"/>
-              <w:jc w:val="left"/>
+          <w:tcPr/>
+          <w:p>
+            <w:pPr>
+              <w:pStyle w:val="Compact"/>
             </w:pPr>
             <w:r>
               <w:t xml:space="preserve">Stakeholder + team</w:t>
@@ -177,10 +151,10 @@
           </w:p>
         </w:tc>
         <w:tc>
-          <w:p>
-            <w:pPr>
-              <w:pStyle w:val="Compact"/>
-              <w:jc w:val="left"/>
+          <w:tcPr/>
+          <w:p>
+            <w:pPr>
+              <w:pStyle w:val="Compact"/>
             </w:pPr>
             <w:r>
               <w:t xml:space="preserve">Stakeholder confirms admin in GitHub repo settings; team verifies.</w:t>
@@ -190,10 +164,10 @@
       </w:tr>
       <w:tr>
         <w:tc>
-          <w:p>
-            <w:pPr>
-              <w:pStyle w:val="Compact"/>
-              <w:jc w:val="left"/>
+          <w:tcPr/>
+          <w:p>
+            <w:pPr>
+              <w:pStyle w:val="Compact"/>
             </w:pPr>
             <w:r>
               <w:t xml:space="preserve">Stakeholder ownership of AWS account, EC2 instance, security group, IAM deploy user</w:t>
@@ -201,10 +175,10 @@
           </w:p>
         </w:tc>
         <w:tc>
-          <w:p>
-            <w:pPr>
-              <w:pStyle w:val="Compact"/>
-              <w:jc w:val="left"/>
+          <w:tcPr/>
+          <w:p>
+            <w:pPr>
+              <w:pStyle w:val="Compact"/>
             </w:pPr>
             <w:r>
               <w:t xml:space="preserve">Pending</w:t>
@@ -212,10 +186,10 @@
           </w:p>
         </w:tc>
         <w:tc>
-          <w:p>
-            <w:pPr>
-              <w:pStyle w:val="Compact"/>
-              <w:jc w:val="left"/>
+          <w:tcPr/>
+          <w:p>
+            <w:pPr>
+              <w:pStyle w:val="Compact"/>
             </w:pPr>
             <w:r>
               <w:t xml:space="preserve">Stakeholder + team</w:t>
@@ -223,10 +197,10 @@
           </w:p>
         </w:tc>
         <w:tc>
-          <w:p>
-            <w:pPr>
-              <w:pStyle w:val="Compact"/>
-              <w:jc w:val="left"/>
+          <w:tcPr/>
+          <w:p>
+            <w:pPr>
+              <w:pStyle w:val="Compact"/>
             </w:pPr>
             <w:r>
               <w:t xml:space="preserve">Stakeholder confirms billing + ownership; team rotates and hands over keys per Operations Runbook §6.</w:t>
@@ -236,10 +210,10 @@
       </w:tr>
       <w:tr>
         <w:tc>
-          <w:p>
-            <w:pPr>
-              <w:pStyle w:val="Compact"/>
-              <w:jc w:val="left"/>
+          <w:tcPr/>
+          <w:p>
+            <w:pPr>
+              <w:pStyle w:val="Compact"/>
             </w:pPr>
             <w:r>
               <w:t xml:space="preserve">Final live-URL smoke test by stakeholder</w:t>
@@ -247,10 +221,10 @@
           </w:p>
         </w:tc>
         <w:tc>
-          <w:p>
-            <w:pPr>
-              <w:pStyle w:val="Compact"/>
-              <w:jc w:val="left"/>
+          <w:tcPr/>
+          <w:p>
+            <w:pPr>
+              <w:pStyle w:val="Compact"/>
             </w:pPr>
             <w:r>
               <w:t xml:space="preserve">Pending</w:t>
@@ -258,10 +232,10 @@
           </w:p>
         </w:tc>
         <w:tc>
-          <w:p>
-            <w:pPr>
-              <w:pStyle w:val="Compact"/>
-              <w:jc w:val="left"/>
+          <w:tcPr/>
+          <w:p>
+            <w:pPr>
+              <w:pStyle w:val="Compact"/>
             </w:pPr>
             <w:r>
               <w:t xml:space="preserve">Stakeholder</w:t>
@@ -269,10 +243,10 @@
           </w:p>
         </w:tc>
         <w:tc>
-          <w:p>
-            <w:pPr>
-              <w:pStyle w:val="Compact"/>
-              <w:jc w:val="left"/>
+          <w:tcPr/>
+          <w:p>
+            <w:pPr>
+              <w:pStyle w:val="Compact"/>
             </w:pPr>
             <w:r>
               <w:t xml:space="preserve">Run the manual QA script in Testing_and_QA_Summary.md §5 against</w:t>
@@ -280,7 +254,7 @@
             <w:r>
               <w:t xml:space="preserve"> </w:t>
             </w:r>
-            <w:hyperlink r:id="rId22">
+            <w:hyperlink r:id="rId9">
               <w:r>
                 <w:rPr>
                   <w:rStyle w:val="Hyperlink"/>
@@ -296,10 +270,10 @@
       </w:tr>
       <w:tr>
         <w:tc>
-          <w:p>
-            <w:pPr>
-              <w:pStyle w:val="Compact"/>
-              <w:jc w:val="left"/>
+          <w:tcPr/>
+          <w:p>
+            <w:pPr>
+              <w:pStyle w:val="Compact"/>
             </w:pPr>
             <w:r>
               <w:t xml:space="preserve">Demo video recorded and linked</w:t>
@@ -307,10 +281,10 @@
           </w:p>
         </w:tc>
         <w:tc>
-          <w:p>
-            <w:pPr>
-              <w:pStyle w:val="Compact"/>
-              <w:jc w:val="left"/>
+          <w:tcPr/>
+          <w:p>
+            <w:pPr>
+              <w:pStyle w:val="Compact"/>
             </w:pPr>
             <w:r>
               <w:t xml:space="preserve">Pending</w:t>
@@ -318,10 +292,10 @@
           </w:p>
         </w:tc>
         <w:tc>
-          <w:p>
-            <w:pPr>
-              <w:pStyle w:val="Compact"/>
-              <w:jc w:val="left"/>
+          <w:tcPr/>
+          <w:p>
+            <w:pPr>
+              <w:pStyle w:val="Compact"/>
             </w:pPr>
             <w:r>
               <w:t xml:space="preserve">Team 34</w:t>
@@ -329,10 +303,10 @@
           </w:p>
         </w:tc>
         <w:tc>
-          <w:p>
-            <w:pPr>
-              <w:pStyle w:val="Compact"/>
-              <w:jc w:val="left"/>
+          <w:tcPr/>
+          <w:p>
+            <w:pPr>
+              <w:pStyle w:val="Compact"/>
             </w:pPr>
             <w:r>
               <w:t xml:space="preserve">Record per Demo_Video_Script_and_Checklist.md, save as</w:t>
@@ -369,10 +343,10 @@
       </w:tr>
       <w:tr>
         <w:tc>
-          <w:p>
-            <w:pPr>
-              <w:pStyle w:val="Compact"/>
-              <w:jc w:val="left"/>
+          <w:tcPr/>
+          <w:p>
+            <w:pPr>
+              <w:pStyle w:val="Compact"/>
             </w:pPr>
             <w:r>
               <w:t xml:space="preserve">Final release tag</w:t>
@@ -389,10 +363,10 @@
           </w:p>
         </w:tc>
         <w:tc>
-          <w:p>
-            <w:pPr>
-              <w:pStyle w:val="Compact"/>
-              <w:jc w:val="left"/>
+          <w:tcPr/>
+          <w:p>
+            <w:pPr>
+              <w:pStyle w:val="Compact"/>
             </w:pPr>
             <w:r>
               <w:t xml:space="preserve">Pending</w:t>
@@ -400,10 +374,10 @@
           </w:p>
         </w:tc>
         <w:tc>
-          <w:p>
-            <w:pPr>
-              <w:pStyle w:val="Compact"/>
-              <w:jc w:val="left"/>
+          <w:tcPr/>
+          <w:p>
+            <w:pPr>
+              <w:pStyle w:val="Compact"/>
             </w:pPr>
             <w:r>
               <w:t xml:space="preserve">Team 34</w:t>
@@ -411,10 +385,10 @@
           </w:p>
         </w:tc>
         <w:tc>
-          <w:p>
-            <w:pPr>
-              <w:pStyle w:val="Compact"/>
-              <w:jc w:val="left"/>
+          <w:tcPr/>
+          <w:p>
+            <w:pPr>
+              <w:pStyle w:val="Compact"/>
             </w:pPr>
             <w:r>
               <w:t xml:space="preserve">Tag after stakeholder approves:</w:t>
@@ -436,10 +410,10 @@
       </w:tr>
       <w:tr>
         <w:tc>
-          <w:p>
-            <w:pPr>
-              <w:pStyle w:val="Compact"/>
-              <w:jc w:val="left"/>
+          <w:tcPr/>
+          <w:p>
+            <w:pPr>
+              <w:pStyle w:val="Compact"/>
             </w:pPr>
             <w:r>
               <w:t xml:space="preserve">Expiration table populated in Operations Runbook §10</w:t>
@@ -447,10 +421,10 @@
           </w:p>
         </w:tc>
         <w:tc>
-          <w:p>
-            <w:pPr>
-              <w:pStyle w:val="Compact"/>
-              <w:jc w:val="left"/>
+          <w:tcPr/>
+          <w:p>
+            <w:pPr>
+              <w:pStyle w:val="Compact"/>
             </w:pPr>
             <w:r>
               <w:t xml:space="preserve">Pending</w:t>
@@ -458,10 +432,10 @@
           </w:p>
         </w:tc>
         <w:tc>
-          <w:p>
-            <w:pPr>
-              <w:pStyle w:val="Compact"/>
-              <w:jc w:val="left"/>
+          <w:tcPr/>
+          <w:p>
+            <w:pPr>
+              <w:pStyle w:val="Compact"/>
             </w:pPr>
             <w:r>
               <w:t xml:space="preserve">Stakeholder</w:t>
@@ -469,10 +443,10 @@
           </w:p>
         </w:tc>
         <w:tc>
-          <w:p>
-            <w:pPr>
-              <w:pStyle w:val="Compact"/>
-              <w:jc w:val="left"/>
+          <w:tcPr/>
+          <w:p>
+            <w:pPr>
+              <w:pStyle w:val="Compact"/>
             </w:pPr>
             <w:r>
               <w:t xml:space="preserve">Fill in IAM key dates, EC2 SSH key date, domain renewal date, TLS cert renewal (when added).</w:t>
@@ -482,10 +456,10 @@
       </w:tr>
       <w:tr>
         <w:tc>
-          <w:p>
-            <w:pPr>
-              <w:pStyle w:val="Compact"/>
-              <w:jc w:val="left"/>
+          <w:tcPr/>
+          <w:p>
+            <w:pPr>
+              <w:pStyle w:val="Compact"/>
             </w:pPr>
             <w:r>
               <w:t xml:space="preserve">Student credentials revoked</w:t>
@@ -493,10 +467,10 @@
           </w:p>
         </w:tc>
         <w:tc>
-          <w:p>
-            <w:pPr>
-              <w:pStyle w:val="Compact"/>
-              <w:jc w:val="left"/>
+          <w:tcPr/>
+          <w:p>
+            <w:pPr>
+              <w:pStyle w:val="Compact"/>
             </w:pPr>
             <w:r>
               <w:t xml:space="preserve">Pending</w:t>
@@ -504,10 +478,10 @@
           </w:p>
         </w:tc>
         <w:tc>
-          <w:p>
-            <w:pPr>
-              <w:pStyle w:val="Compact"/>
-              <w:jc w:val="left"/>
+          <w:tcPr/>
+          <w:p>
+            <w:pPr>
+              <w:pStyle w:val="Compact"/>
             </w:pPr>
             <w:r>
               <w:t xml:space="preserve">Stakeholder</w:t>
@@ -515,10 +489,10 @@
           </w:p>
         </w:tc>
         <w:tc>
-          <w:p>
-            <w:pPr>
-              <w:pStyle w:val="Compact"/>
-              <w:jc w:val="left"/>
+          <w:tcPr/>
+          <w:p>
+            <w:pPr>
+              <w:pStyle w:val="Compact"/>
             </w:pPr>
             <w:r>
               <w:t xml:space="preserve">Revoke after the stakeholder confirms they can build, deploy, and access independently.</w:t>
@@ -528,10 +502,10 @@
       </w:tr>
       <w:tr>
         <w:tc>
-          <w:p>
-            <w:pPr>
-              <w:pStyle w:val="Compact"/>
-              <w:jc w:val="left"/>
+          <w:tcPr/>
+          <w:p>
+            <w:pPr>
+              <w:pStyle w:val="Compact"/>
             </w:pPr>
             <w:r>
               <w:t xml:space="preserve">Stakeholder sign-off received</w:t>
@@ -539,10 +513,10 @@
           </w:p>
         </w:tc>
         <w:tc>
-          <w:p>
-            <w:pPr>
-              <w:pStyle w:val="Compact"/>
-              <w:jc w:val="left"/>
+          <w:tcPr/>
+          <w:p>
+            <w:pPr>
+              <w:pStyle w:val="Compact"/>
             </w:pPr>
             <w:r>
               <w:t xml:space="preserve">Pending</w:t>
@@ -550,10 +524,10 @@
           </w:p>
         </w:tc>
         <w:tc>
-          <w:p>
-            <w:pPr>
-              <w:pStyle w:val="Compact"/>
-              <w:jc w:val="left"/>
+          <w:tcPr/>
+          <w:p>
+            <w:pPr>
+              <w:pStyle w:val="Compact"/>
             </w:pPr>
             <w:r>
               <w:t xml:space="preserve">Stakeholder + team</w:t>
@@ -561,10 +535,10 @@
           </w:p>
         </w:tc>
         <w:tc>
-          <w:p>
-            <w:pPr>
-              <w:pStyle w:val="Compact"/>
-              <w:jc w:val="left"/>
+          <w:tcPr/>
+          <w:p>
+            <w:pPr>
+              <w:pStyle w:val="Compact"/>
             </w:pPr>
             <w:r>
               <w:t xml:space="preserve">Email cover note + this folder; request approval within 48–72 hours.</w:t>
@@ -573,43 +547,36 @@
         </w:tc>
       </w:tr>
     </w:tbl>
+    <w:bookmarkEnd w:id="10"/>
+    <w:bookmarkStart w:id="11" w:name="Xe2ee7fe5398dd4db7fd4809d9dbdad1ce512eb3"/>
     <w:p>
       <w:pPr>
         <w:pStyle w:val="Heading2"/>
       </w:pPr>
-      <w:bookmarkStart w:id="23" w:name="Xe2ee7fe5398dd4db7fd4809d9dbdad1ce512eb3"/>
       <w:r>
         <w:t xml:space="preserve">Priority 1 — Operational hardening (do within 30 days post-handoff)</w:t>
       </w:r>
-      <w:bookmarkEnd w:id="23"/>
     </w:p>
     <w:tbl>
       <w:tblPr>
         <w:tblStyle w:val="Table"/>
-        <w:tblW w:type="pct" w:w="0.0"/>
-        <w:tblLook w:firstRow="1"/>
+        <w:tblW w:type="auto" w:w="0"/>
+        <w:tblLook w:firstRow="1" w:lastRow="0" w:firstColumn="0" w:lastColumn="0" w:noHBand="0" w:noVBand="0" w:val="0020"/>
       </w:tblPr>
       <w:tblGrid>
-        <w:gridCol w:w="3120"/>
-        <w:gridCol w:w="3120"/>
-        <w:gridCol w:w="3120"/>
+        <w:gridCol w:w="2640"/>
+        <w:gridCol w:w="2640"/>
+        <w:gridCol w:w="2640"/>
       </w:tblGrid>
-      <w:tblGrid/>
       <w:tr>
         <w:trPr>
-          <w:cnfStyle w:firstRow="1"/>
+          <w:tblHeader w:val="on"/>
         </w:trPr>
         <w:tc>
-          <w:tcPr>
-            <w:tcBorders>
-              <w:bottom w:val="single"/>
-            </w:tcBorders>
-            <w:vAlign w:val="bottom"/>
-          </w:tcPr>
-          <w:p>
-            <w:pPr>
-              <w:pStyle w:val="Compact"/>
-              <w:jc w:val="left"/>
+          <w:tcPr/>
+          <w:p>
+            <w:pPr>
+              <w:pStyle w:val="Compact"/>
             </w:pPr>
             <w:r>
               <w:t xml:space="preserve">Item</w:t>
@@ -617,16 +584,10 @@
           </w:p>
         </w:tc>
         <w:tc>
-          <w:tcPr>
-            <w:tcBorders>
-              <w:bottom w:val="single"/>
-            </w:tcBorders>
-            <w:vAlign w:val="bottom"/>
-          </w:tcPr>
-          <w:p>
-            <w:pPr>
-              <w:pStyle w:val="Compact"/>
-              <w:jc w:val="left"/>
+          <w:tcPr/>
+          <w:p>
+            <w:pPr>
+              <w:pStyle w:val="Compact"/>
             </w:pPr>
             <w:r>
               <w:t xml:space="preserve">Why it matters</w:t>
@@ -634,16 +595,10 @@
           </w:p>
         </w:tc>
         <w:tc>
-          <w:tcPr>
-            <w:tcBorders>
-              <w:bottom w:val="single"/>
-            </w:tcBorders>
-            <w:vAlign w:val="bottom"/>
-          </w:tcPr>
-          <w:p>
-            <w:pPr>
-              <w:pStyle w:val="Compact"/>
-              <w:jc w:val="left"/>
+          <w:tcPr/>
+          <w:p>
+            <w:pPr>
+              <w:pStyle w:val="Compact"/>
             </w:pPr>
             <w:r>
               <w:t xml:space="preserve">Suggested next step</w:t>
@@ -653,14 +608,15 @@
       </w:tr>
       <w:tr>
         <w:tc>
-          <w:p>
-            <w:pPr>
-              <w:pStyle w:val="Compact"/>
-              <w:jc w:val="left"/>
+          <w:tcPr/>
+          <w:p>
+            <w:pPr>
+              <w:pStyle w:val="Compact"/>
             </w:pPr>
             <w:r>
               <w:rPr>
                 <w:b/>
+                <w:bCs/>
               </w:rPr>
               <w:t xml:space="preserve">TLS / HTTPS</w:t>
             </w:r>
@@ -682,10 +638,10 @@
           </w:p>
         </w:tc>
         <w:tc>
-          <w:p>
-            <w:pPr>
-              <w:pStyle w:val="Compact"/>
-              <w:jc w:val="left"/>
+          <w:tcPr/>
+          <w:p>
+            <w:pPr>
+              <w:pStyle w:val="Compact"/>
             </w:pPr>
             <w:r>
               <w:t xml:space="preserve">Users upload PII (names, phone numbers); HTTP exposes that traffic to MITM observation.</w:t>
@@ -693,10 +649,10 @@
           </w:p>
         </w:tc>
         <w:tc>
-          <w:p>
-            <w:pPr>
-              <w:pStyle w:val="Compact"/>
-              <w:jc w:val="left"/>
+          <w:tcPr/>
+          <w:p>
+            <w:pPr>
+              <w:pStyle w:val="Compact"/>
             </w:pPr>
             <w:r>
               <w:rPr>
@@ -727,10 +683,10 @@
       </w:tr>
       <w:tr>
         <w:tc>
-          <w:p>
-            <w:pPr>
-              <w:pStyle w:val="Compact"/>
-              <w:jc w:val="left"/>
+          <w:tcPr/>
+          <w:p>
+            <w:pPr>
+              <w:pStyle w:val="Compact"/>
             </w:pPr>
             <w:r>
               <w:t xml:space="preserve">Document the EC2 web-server config (nginx vs Apache, vhost path, log paths)</w:t>
@@ -738,10 +694,10 @@
           </w:p>
         </w:tc>
         <w:tc>
-          <w:p>
-            <w:pPr>
-              <w:pStyle w:val="Compact"/>
-              <w:jc w:val="left"/>
+          <w:tcPr/>
+          <w:p>
+            <w:pPr>
+              <w:pStyle w:val="Compact"/>
             </w:pPr>
             <w:r>
               <w:t xml:space="preserve">The runbook currently lists generic paths; on-call needs the real ones.</w:t>
@@ -749,10 +705,10 @@
           </w:p>
         </w:tc>
         <w:tc>
-          <w:p>
-            <w:pPr>
-              <w:pStyle w:val="Compact"/>
-              <w:jc w:val="left"/>
+          <w:tcPr/>
+          <w:p>
+            <w:pPr>
+              <w:pStyle w:val="Compact"/>
             </w:pPr>
             <w:r>
               <w:t xml:space="preserve">SSH in once, capture</w:t>
@@ -789,10 +745,10 @@
       </w:tr>
       <w:tr>
         <w:tc>
-          <w:p>
-            <w:pPr>
-              <w:pStyle w:val="Compact"/>
-              <w:jc w:val="left"/>
+          <w:tcPr/>
+          <w:p>
+            <w:pPr>
+              <w:pStyle w:val="Compact"/>
             </w:pPr>
             <w:r>
               <w:t xml:space="preserve">Add uptime monitoring on the live URL</w:t>
@@ -800,10 +756,10 @@
           </w:p>
         </w:tc>
         <w:tc>
-          <w:p>
-            <w:pPr>
-              <w:pStyle w:val="Compact"/>
-              <w:jc w:val="left"/>
+          <w:tcPr/>
+          <w:p>
+            <w:pPr>
+              <w:pStyle w:val="Compact"/>
             </w:pPr>
             <w:r>
               <w:t xml:space="preserve">The site is unmonitored today; outages will surface only when an admin tries to use it.</w:t>
@@ -811,10 +767,10 @@
           </w:p>
         </w:tc>
         <w:tc>
-          <w:p>
-            <w:pPr>
-              <w:pStyle w:val="Compact"/>
-              <w:jc w:val="left"/>
+          <w:tcPr/>
+          <w:p>
+            <w:pPr>
+              <w:pStyle w:val="Compact"/>
             </w:pPr>
             <w:r>
               <w:t xml:space="preserve">UptimeRobot, BetterStack, or AWS Route 53 health check (alert to stakeholder email).</w:t>
@@ -824,10 +780,10 @@
       </w:tr>
       <w:tr>
         <w:tc>
-          <w:p>
-            <w:pPr>
-              <w:pStyle w:val="Compact"/>
-              <w:jc w:val="left"/>
+          <w:tcPr/>
+          <w:p>
+            <w:pPr>
+              <w:pStyle w:val="Compact"/>
             </w:pPr>
             <w:r>
               <w:t xml:space="preserve">Branch protection on</w:t>
@@ -844,10 +800,10 @@
           </w:p>
         </w:tc>
         <w:tc>
-          <w:p>
-            <w:pPr>
-              <w:pStyle w:val="Compact"/>
-              <w:jc w:val="left"/>
+          <w:tcPr/>
+          <w:p>
+            <w:pPr>
+              <w:pStyle w:val="Compact"/>
             </w:pPr>
             <w:r>
               <w:t xml:space="preserve">Prevent accidental force-push and unreviewed merges.</w:t>
@@ -855,10 +811,10 @@
           </w:p>
         </w:tc>
         <w:tc>
-          <w:p>
-            <w:pPr>
-              <w:pStyle w:val="Compact"/>
-              <w:jc w:val="left"/>
+          <w:tcPr/>
+          <w:p>
+            <w:pPr>
+              <w:pStyle w:val="Compact"/>
             </w:pPr>
             <w:r>
               <w:t xml:space="preserve">GitHub Settings → Branches → Protection rule for</w:t>
@@ -889,10 +845,10 @@
       </w:tr>
       <w:tr>
         <w:tc>
-          <w:p>
-            <w:pPr>
-              <w:pStyle w:val="Compact"/>
-              <w:jc w:val="left"/>
+          <w:tcPr/>
+          <w:p>
+            <w:pPr>
+              <w:pStyle w:val="Compact"/>
             </w:pPr>
             <w:r>
               <w:t xml:space="preserve">Build-artifact archival</w:t>
@@ -900,10 +856,10 @@
           </w:p>
         </w:tc>
         <w:tc>
-          <w:p>
-            <w:pPr>
-              <w:pStyle w:val="Compact"/>
-              <w:jc w:val="left"/>
+          <w:tcPr/>
+          <w:p>
+            <w:pPr>
+              <w:pStyle w:val="Compact"/>
             </w:pPr>
             <w:r>
               <w:t xml:space="preserve">Today rollback means rebuild; artifact archive makes rollback a copy.</w:t>
@@ -911,10 +867,10 @@
           </w:p>
         </w:tc>
         <w:tc>
-          <w:p>
-            <w:pPr>
-              <w:pStyle w:val="Compact"/>
-              <w:jc w:val="left"/>
+          <w:tcPr/>
+          <w:p>
+            <w:pPr>
+              <w:pStyle w:val="Compact"/>
             </w:pPr>
             <w:r>
               <w:t xml:space="preserve">Add a step to</w:t>
@@ -966,10 +922,10 @@
       </w:tr>
       <w:tr>
         <w:tc>
-          <w:p>
-            <w:pPr>
-              <w:pStyle w:val="Compact"/>
-              <w:jc w:val="left"/>
+          <w:tcPr/>
+          <w:p>
+            <w:pPr>
+              <w:pStyle w:val="Compact"/>
             </w:pPr>
             <w:r>
               <w:t xml:space="preserve">Dependabot on</w:t>
@@ -992,10 +948,10 @@
           </w:p>
         </w:tc>
         <w:tc>
-          <w:p>
-            <w:pPr>
-              <w:pStyle w:val="Compact"/>
-              <w:jc w:val="left"/>
+          <w:tcPr/>
+          <w:p>
+            <w:pPr>
+              <w:pStyle w:val="Compact"/>
             </w:pPr>
             <w:r>
               <w:t xml:space="preserve">Surface dependency drift as PRs.</w:t>
@@ -1003,10 +959,10 @@
           </w:p>
         </w:tc>
         <w:tc>
-          <w:p>
-            <w:pPr>
-              <w:pStyle w:val="Compact"/>
-              <w:jc w:val="left"/>
+          <w:tcPr/>
+          <w:p>
+            <w:pPr>
+              <w:pStyle w:val="Compact"/>
             </w:pPr>
             <w:r>
               <w:t xml:space="preserve">Enable Dependabot in repo settings; set a weekly schedule.</w:t>
@@ -1015,43 +971,36 @@
         </w:tc>
       </w:tr>
     </w:tbl>
+    <w:bookmarkEnd w:id="11"/>
+    <w:bookmarkStart w:id="12" w:name="X4bccd0248249348a940622c4d12f53228f03a2e"/>
     <w:p>
       <w:pPr>
         <w:pStyle w:val="Heading2"/>
       </w:pPr>
-      <w:bookmarkStart w:id="24" w:name="X4bccd0248249348a940622c4d12f53228f03a2e"/>
       <w:r>
         <w:t xml:space="preserve">Priority 2 — Product enhancements (next quarter or as stakeholder requests)</w:t>
       </w:r>
-      <w:bookmarkEnd w:id="24"/>
     </w:p>
     <w:tbl>
       <w:tblPr>
         <w:tblStyle w:val="Table"/>
-        <w:tblW w:type="pct" w:w="0.0"/>
-        <w:tblLook w:firstRow="1"/>
+        <w:tblW w:type="auto" w:w="0"/>
+        <w:tblLook w:firstRow="1" w:lastRow="0" w:firstColumn="0" w:lastColumn="0" w:noHBand="0" w:noVBand="0" w:val="0020"/>
       </w:tblPr>
       <w:tblGrid>
-        <w:gridCol w:w="3120"/>
-        <w:gridCol w:w="3120"/>
-        <w:gridCol w:w="3120"/>
+        <w:gridCol w:w="2640"/>
+        <w:gridCol w:w="2640"/>
+        <w:gridCol w:w="2640"/>
       </w:tblGrid>
-      <w:tblGrid/>
       <w:tr>
         <w:trPr>
-          <w:cnfStyle w:firstRow="1"/>
+          <w:tblHeader w:val="on"/>
         </w:trPr>
         <w:tc>
-          <w:tcPr>
-            <w:tcBorders>
-              <w:bottom w:val="single"/>
-            </w:tcBorders>
-            <w:vAlign w:val="bottom"/>
-          </w:tcPr>
-          <w:p>
-            <w:pPr>
-              <w:pStyle w:val="Compact"/>
-              <w:jc w:val="left"/>
+          <w:tcPr/>
+          <w:p>
+            <w:pPr>
+              <w:pStyle w:val="Compact"/>
             </w:pPr>
             <w:r>
               <w:t xml:space="preserve">Item</w:t>
@@ -1059,16 +1008,10 @@
           </w:p>
         </w:tc>
         <w:tc>
-          <w:tcPr>
-            <w:tcBorders>
-              <w:bottom w:val="single"/>
-            </w:tcBorders>
-            <w:vAlign w:val="bottom"/>
-          </w:tcPr>
-          <w:p>
-            <w:pPr>
-              <w:pStyle w:val="Compact"/>
-              <w:jc w:val="left"/>
+          <w:tcPr/>
+          <w:p>
+            <w:pPr>
+              <w:pStyle w:val="Compact"/>
             </w:pPr>
             <w:r>
               <w:t xml:space="preserve">Why it matters</w:t>
@@ -1076,16 +1019,10 @@
           </w:p>
         </w:tc>
         <w:tc>
-          <w:tcPr>
-            <w:tcBorders>
-              <w:bottom w:val="single"/>
-            </w:tcBorders>
-            <w:vAlign w:val="bottom"/>
-          </w:tcPr>
-          <w:p>
-            <w:pPr>
-              <w:pStyle w:val="Compact"/>
-              <w:jc w:val="left"/>
+          <w:tcPr/>
+          <w:p>
+            <w:pPr>
+              <w:pStyle w:val="Compact"/>
             </w:pPr>
             <w:r>
               <w:t xml:space="preserve">Suggested next step</w:t>
@@ -1095,24 +1032,25 @@
       </w:tr>
       <w:tr>
         <w:tc>
-          <w:p>
-            <w:pPr>
-              <w:pStyle w:val="Compact"/>
-              <w:jc w:val="left"/>
+          <w:tcPr/>
+          <w:p>
+            <w:pPr>
+              <w:pStyle w:val="Compact"/>
             </w:pPr>
             <w:r>
               <w:rPr>
                 <w:b/>
+                <w:bCs/>
               </w:rPr>
               <w:t xml:space="preserve">Migrate hosting to S3 + CloudFront</w:t>
             </w:r>
           </w:p>
         </w:tc>
         <w:tc>
-          <w:p>
-            <w:pPr>
-              <w:pStyle w:val="Compact"/>
-              <w:jc w:val="left"/>
+          <w:tcPr/>
+          <w:p>
+            <w:pPr>
+              <w:pStyle w:val="Compact"/>
             </w:pPr>
             <w:r>
               <w:t xml:space="preserve">Eliminates EC2 patching, gives free TLS, makes rollback trivial via versioned prefixes.</w:t>
@@ -1120,10 +1058,10 @@
           </w:p>
         </w:tc>
         <w:tc>
-          <w:p>
-            <w:pPr>
-              <w:pStyle w:val="Compact"/>
-              <w:jc w:val="left"/>
+          <w:tcPr/>
+          <w:p>
+            <w:pPr>
+              <w:pStyle w:val="Compact"/>
             </w:pPr>
             <w:r>
               <w:t xml:space="preserve">Replace</w:t>
@@ -1163,14 +1101,15 @@
       </w:tr>
       <w:tr>
         <w:tc>
-          <w:p>
-            <w:pPr>
-              <w:pStyle w:val="Compact"/>
-              <w:jc w:val="left"/>
+          <w:tcPr/>
+          <w:p>
+            <w:pPr>
+              <w:pStyle w:val="Compact"/>
             </w:pPr>
             <w:r>
               <w:rPr>
                 <w:b/>
+                <w:bCs/>
               </w:rPr>
               <w:t xml:space="preserve">CSV exports</w:t>
             </w:r>
@@ -1183,10 +1122,10 @@
           </w:p>
         </w:tc>
         <w:tc>
-          <w:p>
-            <w:pPr>
-              <w:pStyle w:val="Compact"/>
-              <w:jc w:val="left"/>
+          <w:tcPr/>
+          <w:p>
+            <w:pPr>
+              <w:pStyle w:val="Compact"/>
             </w:pPr>
             <w:r>
               <w:t xml:space="preserve">Easier to drop into spreadsheets / Mailchimp.</w:t>
@@ -1194,10 +1133,10 @@
           </w:p>
         </w:tc>
         <w:tc>
-          <w:p>
-            <w:pPr>
-              <w:pStyle w:val="Compact"/>
-              <w:jc w:val="left"/>
+          <w:tcPr/>
+          <w:p>
+            <w:pPr>
+              <w:pStyle w:val="Compact"/>
             </w:pPr>
             <w:r>
               <w:t xml:space="preserve">Wrap the existing</w:t>
@@ -1267,10 +1206,10 @@
       </w:tr>
       <w:tr>
         <w:tc>
-          <w:p>
-            <w:pPr>
-              <w:pStyle w:val="Compact"/>
-              <w:jc w:val="left"/>
+          <w:tcPr/>
+          <w:p>
+            <w:pPr>
+              <w:pStyle w:val="Compact"/>
             </w:pPr>
             <w:r>
               <w:t xml:space="preserve">Cross-browser save-dialog matrix</w:t>
@@ -1278,10 +1217,10 @@
           </w:p>
         </w:tc>
         <w:tc>
-          <w:p>
-            <w:pPr>
-              <w:pStyle w:val="Compact"/>
-              <w:jc w:val="left"/>
+          <w:tcPr/>
+          <w:p>
+            <w:pPr>
+              <w:pStyle w:val="Compact"/>
             </w:pPr>
             <w:r>
               <w:rPr>
@@ -1298,10 +1237,10 @@
           </w:p>
         </w:tc>
         <w:tc>
-          <w:p>
-            <w:pPr>
-              <w:pStyle w:val="Compact"/>
-              <w:jc w:val="left"/>
+          <w:tcPr/>
+          <w:p>
+            <w:pPr>
+              <w:pStyle w:val="Compact"/>
             </w:pPr>
             <w:r>
               <w:t xml:space="preserve">Manual matrix across Chrome, Edge, Safari, Firefox; capture screenshots; document fallback behavior in</w:t>
@@ -1323,24 +1262,25 @@
       </w:tr>
       <w:tr>
         <w:tc>
-          <w:p>
-            <w:pPr>
-              <w:pStyle w:val="Compact"/>
-              <w:jc w:val="left"/>
+          <w:tcPr/>
+          <w:p>
+            <w:pPr>
+              <w:pStyle w:val="Compact"/>
             </w:pPr>
             <w:r>
               <w:rPr>
                 <w:b/>
+                <w:bCs/>
               </w:rPr>
               <w:t xml:space="preserve">Code-coverage tooling</w:t>
             </w:r>
           </w:p>
         </w:tc>
         <w:tc>
-          <w:p>
-            <w:pPr>
-              <w:pStyle w:val="Compact"/>
-              <w:jc w:val="left"/>
+          <w:tcPr/>
+          <w:p>
+            <w:pPr>
+              <w:pStyle w:val="Compact"/>
             </w:pPr>
             <w:r>
               <w:t xml:space="preserve">No coverage report today.</w:t>
@@ -1348,10 +1288,10 @@
           </w:p>
         </w:tc>
         <w:tc>
-          <w:p>
-            <w:pPr>
-              <w:pStyle w:val="Compact"/>
-              <w:jc w:val="left"/>
+          <w:tcPr/>
+          <w:p>
+            <w:pPr>
+              <w:pStyle w:val="Compact"/>
             </w:pPr>
             <w:r>
               <w:t xml:space="preserve">Add</w:t>
@@ -1400,10 +1340,10 @@
       </w:tr>
       <w:tr>
         <w:tc>
-          <w:p>
-            <w:pPr>
-              <w:pStyle w:val="Compact"/>
-              <w:jc w:val="left"/>
+          <w:tcPr/>
+          <w:p>
+            <w:pPr>
+              <w:pStyle w:val="Compact"/>
             </w:pPr>
             <w:r>
               <w:t xml:space="preserve">Performance profile with stakeholder-scale data</w:t>
@@ -1411,10 +1351,10 @@
           </w:p>
         </w:tc>
         <w:tc>
-          <w:p>
-            <w:pPr>
-              <w:pStyle w:val="Compact"/>
-              <w:jc w:val="left"/>
+          <w:tcPr/>
+          <w:p>
+            <w:pPr>
+              <w:pStyle w:val="Compact"/>
             </w:pPr>
             <w:r>
               <w:t xml:space="preserve">Canonical fixture is 24/267; production may grow.</w:t>
@@ -1422,10 +1362,10 @@
           </w:p>
         </w:tc>
         <w:tc>
-          <w:p>
-            <w:pPr>
-              <w:pStyle w:val="Compact"/>
-              <w:jc w:val="left"/>
+          <w:tcPr/>
+          <w:p>
+            <w:pPr>
+              <w:pStyle w:val="Compact"/>
             </w:pPr>
             <w:r>
               <w:t xml:space="preserve">Add a</w:t>
@@ -1450,10 +1390,10 @@
       </w:tr>
       <w:tr>
         <w:tc>
-          <w:p>
-            <w:pPr>
-              <w:pStyle w:val="Compact"/>
-              <w:jc w:val="left"/>
+          <w:tcPr/>
+          <w:p>
+            <w:pPr>
+              <w:pStyle w:val="Compact"/>
             </w:pPr>
             <w:r>
               <w:t xml:space="preserve">Incremental autosave format</w:t>
@@ -1461,10 +1401,10 @@
           </w:p>
         </w:tc>
         <w:tc>
-          <w:p>
-            <w:pPr>
-              <w:pStyle w:val="Compact"/>
-              <w:jc w:val="left"/>
+          <w:tcPr/>
+          <w:p>
+            <w:pPr>
+              <w:pStyle w:val="Compact"/>
             </w:pPr>
             <w:r>
               <w:t xml:space="preserve">Today's autosave bundles the whole file on every change.</w:t>
@@ -1472,10 +1412,10 @@
           </w:p>
         </w:tc>
         <w:tc>
-          <w:p>
-            <w:pPr>
-              <w:pStyle w:val="Compact"/>
-              <w:jc w:val="left"/>
+          <w:tcPr/>
+          <w:p>
+            <w:pPr>
+              <w:pStyle w:val="Compact"/>
             </w:pPr>
             <w:r>
               <w:t xml:space="preserve">Diff-based or keyed-section autosave reduces</w:t>
@@ -1499,42 +1439,35 @@
         </w:tc>
       </w:tr>
     </w:tbl>
+    <w:bookmarkEnd w:id="12"/>
+    <w:bookmarkStart w:id="13" w:name="X5b2439119410b79ddf73f822dfaf0035ef7b84b"/>
     <w:p>
       <w:pPr>
         <w:pStyle w:val="Heading2"/>
       </w:pPr>
-      <w:bookmarkStart w:id="25" w:name="X5b2439119410b79ddf73f822dfaf0035ef7b84b"/>
       <w:r>
         <w:t xml:space="preserve">Priority 3 — Accessibility, polish, longer-term</w:t>
       </w:r>
-      <w:bookmarkEnd w:id="25"/>
     </w:p>
     <w:tbl>
       <w:tblPr>
         <w:tblStyle w:val="Table"/>
-        <w:tblW w:type="pct" w:w="0.0"/>
-        <w:tblLook w:firstRow="1"/>
+        <w:tblW w:type="auto" w:w="0"/>
+        <w:tblLook w:firstRow="1" w:lastRow="0" w:firstColumn="0" w:lastColumn="0" w:noHBand="0" w:noVBand="0" w:val="0020"/>
       </w:tblPr>
       <w:tblGrid>
-        <w:gridCol w:w="4680"/>
-        <w:gridCol w:w="4680"/>
+        <w:gridCol w:w="3960"/>
+        <w:gridCol w:w="3960"/>
       </w:tblGrid>
-      <w:tblGrid/>
       <w:tr>
         <w:trPr>
-          <w:cnfStyle w:firstRow="1"/>
+          <w:tblHeader w:val="on"/>
         </w:trPr>
         <w:tc>
-          <w:tcPr>
-            <w:tcBorders>
-              <w:bottom w:val="single"/>
-            </w:tcBorders>
-            <w:vAlign w:val="bottom"/>
-          </w:tcPr>
-          <w:p>
-            <w:pPr>
-              <w:pStyle w:val="Compact"/>
-              <w:jc w:val="left"/>
+          <w:tcPr/>
+          <w:p>
+            <w:pPr>
+              <w:pStyle w:val="Compact"/>
             </w:pPr>
             <w:r>
               <w:t xml:space="preserve">Item</w:t>
@@ -1542,16 +1475,10 @@
           </w:p>
         </w:tc>
         <w:tc>
-          <w:tcPr>
-            <w:tcBorders>
-              <w:bottom w:val="single"/>
-            </w:tcBorders>
-            <w:vAlign w:val="bottom"/>
-          </w:tcPr>
-          <w:p>
-            <w:pPr>
-              <w:pStyle w:val="Compact"/>
-              <w:jc w:val="left"/>
+          <w:tcPr/>
+          <w:p>
+            <w:pPr>
+              <w:pStyle w:val="Compact"/>
             </w:pPr>
             <w:r>
               <w:t xml:space="preserve">Suggested next step</w:t>
@@ -1561,10 +1488,10 @@
       </w:tr>
       <w:tr>
         <w:tc>
-          <w:p>
-            <w:pPr>
-              <w:pStyle w:val="Compact"/>
-              <w:jc w:val="left"/>
+          <w:tcPr/>
+          <w:p>
+            <w:pPr>
+              <w:pStyle w:val="Compact"/>
             </w:pPr>
             <w:r>
               <w:t xml:space="preserve">Keyboard-only audit</w:t>
@@ -1572,10 +1499,10 @@
           </w:p>
         </w:tc>
         <w:tc>
-          <w:p>
-            <w:pPr>
-              <w:pStyle w:val="Compact"/>
-              <w:jc w:val="left"/>
+          <w:tcPr/>
+          <w:p>
+            <w:pPr>
+              <w:pStyle w:val="Compact"/>
             </w:pPr>
             <w:r>
               <w:t xml:space="preserve">Walk the entire workflow with the mouse unplugged; add focus traps and tab-order fixes where needed.</w:t>
@@ -1585,10 +1512,10 @@
       </w:tr>
       <w:tr>
         <w:tc>
-          <w:p>
-            <w:pPr>
-              <w:pStyle w:val="Compact"/>
-              <w:jc w:val="left"/>
+          <w:tcPr/>
+          <w:p>
+            <w:pPr>
+              <w:pStyle w:val="Compact"/>
             </w:pPr>
             <w:r>
               <w:t xml:space="preserve">Screen-reader labels</w:t>
@@ -1596,10 +1523,10 @@
           </w:p>
         </w:tc>
         <w:tc>
-          <w:p>
-            <w:pPr>
-              <w:pStyle w:val="Compact"/>
-              <w:jc w:val="left"/>
+          <w:tcPr/>
+          <w:p>
+            <w:pPr>
+              <w:pStyle w:val="Compact"/>
             </w:pPr>
             <w:r>
               <w:t xml:space="preserve">Add</w:t>
@@ -1624,10 +1551,10 @@
       </w:tr>
       <w:tr>
         <w:tc>
-          <w:p>
-            <w:pPr>
-              <w:pStyle w:val="Compact"/>
-              <w:jc w:val="left"/>
+          <w:tcPr/>
+          <w:p>
+            <w:pPr>
+              <w:pStyle w:val="Compact"/>
             </w:pPr>
             <w:r>
               <w:t xml:space="preserve">Color contrast pass</w:t>
@@ -1635,10 +1562,10 @@
           </w:p>
         </w:tc>
         <w:tc>
-          <w:p>
-            <w:pPr>
-              <w:pStyle w:val="Compact"/>
-              <w:jc w:val="left"/>
+          <w:tcPr/>
+          <w:p>
+            <w:pPr>
+              <w:pStyle w:val="Compact"/>
             </w:pPr>
             <w:r>
               <w:t xml:space="preserve">Verify WCAG-AA on coordinator highlights, drop/split state, and overview text.</w:t>
@@ -1648,10 +1575,10 @@
       </w:tr>
       <w:tr>
         <w:tc>
-          <w:p>
-            <w:pPr>
-              <w:pStyle w:val="Compact"/>
-              <w:jc w:val="left"/>
+          <w:tcPr/>
+          <w:p>
+            <w:pPr>
+              <w:pStyle w:val="Compact"/>
             </w:pPr>
             <w:r>
               <w:t xml:space="preserve">Larger / zoomed window QA</w:t>
@@ -1659,10 +1586,10 @@
           </w:p>
         </w:tc>
         <w:tc>
-          <w:p>
-            <w:pPr>
-              <w:pStyle w:val="Compact"/>
-              <w:jc w:val="left"/>
+          <w:tcPr/>
+          <w:p>
+            <w:pPr>
+              <w:pStyle w:val="Compact"/>
             </w:pPr>
             <w:r>
               <w:t xml:space="preserve">125%, 150% zoom; confirm no overlap and the table is still scannable.</w:t>
@@ -1672,10 +1599,10 @@
       </w:tr>
       <w:tr>
         <w:tc>
-          <w:p>
-            <w:pPr>
-              <w:pStyle w:val="Compact"/>
-              <w:jc w:val="left"/>
+          <w:tcPr/>
+          <w:p>
+            <w:pPr>
+              <w:pStyle w:val="Compact"/>
             </w:pPr>
             <w:r>
               <w:t xml:space="preserve">Inline file-diff helper for "inconsistent" state</w:t>
@@ -1683,10 +1610,10 @@
           </w:p>
         </w:tc>
         <w:tc>
-          <w:p>
-            <w:pPr>
-              <w:pStyle w:val="Compact"/>
-              <w:jc w:val="left"/>
+          <w:tcPr/>
+          <w:p>
+            <w:pPr>
+              <w:pStyle w:val="Compact"/>
             </w:pPr>
             <w:r>
               <w:t xml:space="preserve">When a people row references an unknown course, surface the exact diff inline rather than only in an exception message.</w:t>
@@ -1696,10 +1623,10 @@
       </w:tr>
       <w:tr>
         <w:tc>
-          <w:p>
-            <w:pPr>
-              <w:pStyle w:val="Compact"/>
-              <w:jc w:val="left"/>
+          <w:tcPr/>
+          <w:p>
+            <w:pPr>
+              <w:pStyle w:val="Compact"/>
             </w:pPr>
             <w:r>
               <w:t xml:space="preserve">Saved-session manager</w:t>
@@ -1707,10 +1634,10 @@
           </w:p>
         </w:tc>
         <w:tc>
-          <w:p>
-            <w:pPr>
-              <w:pStyle w:val="Compact"/>
-              <w:jc w:val="left"/>
+          <w:tcPr/>
+          <w:p>
+            <w:pPr>
+              <w:pStyle w:val="Compact"/>
             </w:pPr>
             <w:r>
               <w:t xml:space="preserve">Move from "one bundled file at a time" to a per-term archive view (still client-side; uses</w:t>
@@ -1734,27 +1661,28 @@
         </w:tc>
       </w:tr>
     </w:tbl>
+    <w:bookmarkEnd w:id="13"/>
+    <w:bookmarkStart w:id="14" w:name="out-of-scope-intentionally-not-delivered"/>
     <w:p>
       <w:pPr>
         <w:pStyle w:val="Heading2"/>
       </w:pPr>
-      <w:bookmarkStart w:id="26" w:name="out-of-scope-intentionally-not-delivered"/>
       <w:r>
         <w:t xml:space="preserve">Out of scope (intentionally not delivered)</w:t>
       </w:r>
-      <w:bookmarkEnd w:id="26"/>
     </w:p>
     <w:p>
       <w:pPr>
+        <w:pStyle w:val="Compact"/>
         <w:numPr>
           <w:ilvl w:val="0"/>
           <w:numId w:val="1001"/>
         </w:numPr>
-        <w:pStyle w:val="Compact"/>
       </w:pPr>
       <w:r>
         <w:rPr>
           <w:b/>
+          <w:bCs/>
         </w:rPr>
         <w:t xml:space="preserve">AI-assisted scheduling.</w:t>
       </w:r>
@@ -1767,15 +1695,16 @@
     </w:p>
     <w:p>
       <w:pPr>
+        <w:pStyle w:val="Compact"/>
         <w:numPr>
           <w:ilvl w:val="0"/>
           <w:numId w:val="1001"/>
         </w:numPr>
-        <w:pStyle w:val="Compact"/>
       </w:pPr>
       <w:r>
         <w:rPr>
           <w:b/>
+          <w:bCs/>
         </w:rPr>
         <w:t xml:space="preserve">Multi-user collaboration / real-time editing.</w:t>
       </w:r>
@@ -1788,15 +1717,16 @@
     </w:p>
     <w:p>
       <w:pPr>
+        <w:pStyle w:val="Compact"/>
         <w:numPr>
           <w:ilvl w:val="0"/>
           <w:numId w:val="1001"/>
         </w:numPr>
-        <w:pStyle w:val="Compact"/>
       </w:pPr>
       <w:r>
         <w:rPr>
           <w:b/>
+          <w:bCs/>
         </w:rPr>
         <w:t xml:space="preserve">Member-facing self-service portal.</w:t>
       </w:r>
@@ -1807,44 +1737,37 @@
         <w:t xml:space="preserve">Out of scope; admin-facing tool only.</w:t>
       </w:r>
     </w:p>
+    <w:bookmarkEnd w:id="14"/>
+    <w:bookmarkStart w:id="15" w:name="X2cc5e61915f9317c104b7030dee7978b310072f"/>
     <w:p>
       <w:pPr>
         <w:pStyle w:val="Heading2"/>
       </w:pPr>
-      <w:bookmarkStart w:id="27" w:name="X2cc5e61915f9317c104b7030dee7978b310072f"/>
       <w:r>
         <w:t xml:space="preserve">Known issues (for transparency, not blockers)</w:t>
       </w:r>
-      <w:bookmarkEnd w:id="27"/>
     </w:p>
     <w:tbl>
       <w:tblPr>
         <w:tblStyle w:val="Table"/>
-        <w:tblW w:type="pct" w:w="0.0"/>
-        <w:tblLook w:firstRow="1"/>
+        <w:tblW w:type="auto" w:w="0"/>
+        <w:tblLook w:firstRow="1" w:lastRow="0" w:firstColumn="0" w:lastColumn="0" w:noHBand="0" w:noVBand="0" w:val="0020"/>
       </w:tblPr>
       <w:tblGrid>
-        <w:gridCol w:w="2340"/>
-        <w:gridCol w:w="2340"/>
-        <w:gridCol w:w="2340"/>
-        <w:gridCol w:w="2340"/>
+        <w:gridCol w:w="1980"/>
+        <w:gridCol w:w="1980"/>
+        <w:gridCol w:w="1980"/>
+        <w:gridCol w:w="1980"/>
       </w:tblGrid>
-      <w:tblGrid/>
       <w:tr>
         <w:trPr>
-          <w:cnfStyle w:firstRow="1"/>
+          <w:tblHeader w:val="on"/>
         </w:trPr>
         <w:tc>
-          <w:tcPr>
-            <w:tcBorders>
-              <w:bottom w:val="single"/>
-            </w:tcBorders>
-            <w:vAlign w:val="bottom"/>
-          </w:tcPr>
-          <w:p>
-            <w:pPr>
-              <w:pStyle w:val="Compact"/>
-              <w:jc w:val="left"/>
+          <w:tcPr/>
+          <w:p>
+            <w:pPr>
+              <w:pStyle w:val="Compact"/>
             </w:pPr>
             <w:r>
               <w:t xml:space="preserve">Issue</w:t>
@@ -1852,16 +1775,10 @@
           </w:p>
         </w:tc>
         <w:tc>
-          <w:tcPr>
-            <w:tcBorders>
-              <w:bottom w:val="single"/>
-            </w:tcBorders>
-            <w:vAlign w:val="bottom"/>
-          </w:tcPr>
-          <w:p>
-            <w:pPr>
-              <w:pStyle w:val="Compact"/>
-              <w:jc w:val="left"/>
+          <w:tcPr/>
+          <w:p>
+            <w:pPr>
+              <w:pStyle w:val="Compact"/>
             </w:pPr>
             <w:r>
               <w:t xml:space="preserve">Symptom</w:t>
@@ -1869,16 +1786,10 @@
           </w:p>
         </w:tc>
         <w:tc>
-          <w:tcPr>
-            <w:tcBorders>
-              <w:bottom w:val="single"/>
-            </w:tcBorders>
-            <w:vAlign w:val="bottom"/>
-          </w:tcPr>
-          <w:p>
-            <w:pPr>
-              <w:pStyle w:val="Compact"/>
-              <w:jc w:val="left"/>
+          <w:tcPr/>
+          <w:p>
+            <w:pPr>
+              <w:pStyle w:val="Compact"/>
             </w:pPr>
             <w:r>
               <w:t xml:space="preserve">Workaround</w:t>
@@ -1886,16 +1797,10 @@
           </w:p>
         </w:tc>
         <w:tc>
-          <w:tcPr>
-            <w:tcBorders>
-              <w:bottom w:val="single"/>
-            </w:tcBorders>
-            <w:vAlign w:val="bottom"/>
-          </w:tcPr>
-          <w:p>
-            <w:pPr>
-              <w:pStyle w:val="Compact"/>
-              <w:jc w:val="left"/>
+          <w:tcPr/>
+          <w:p>
+            <w:pPr>
+              <w:pStyle w:val="Compact"/>
             </w:pPr>
             <w:r>
               <w:t xml:space="preserve">Tracked in</w:t>
@@ -1905,10 +1810,10 @@
       </w:tr>
       <w:tr>
         <w:tc>
-          <w:p>
-            <w:pPr>
-              <w:pStyle w:val="Compact"/>
-              <w:jc w:val="left"/>
+          <w:tcPr/>
+          <w:p>
+            <w:pPr>
+              <w:pStyle w:val="Compact"/>
             </w:pPr>
             <w:r>
               <w:rPr>
@@ -1925,10 +1830,10 @@
           </w:p>
         </w:tc>
         <w:tc>
-          <w:p>
-            <w:pPr>
-              <w:pStyle w:val="Compact"/>
-              <w:jc w:val="left"/>
+          <w:tcPr/>
+          <w:p>
+            <w:pPr>
+              <w:pStyle w:val="Compact"/>
             </w:pPr>
             <w:r>
               <w:t xml:space="preserve">Save dialog never appears; file lands in browser downloads with the suggested name.</w:t>
@@ -1936,10 +1841,10 @@
           </w:p>
         </w:tc>
         <w:tc>
-          <w:p>
-            <w:pPr>
-              <w:pStyle w:val="Compact"/>
-              <w:jc w:val="left"/>
+          <w:tcPr/>
+          <w:p>
+            <w:pPr>
+              <w:pStyle w:val="Compact"/>
             </w:pPr>
             <w:r>
               <w:t xml:space="preserve">Use Chrome/Edge if a save dialog is needed; otherwise accept the download.</w:t>
@@ -1947,10 +1852,10 @@
           </w:p>
         </w:tc>
         <w:tc>
-          <w:p>
-            <w:pPr>
-              <w:pStyle w:val="Compact"/>
-              <w:jc w:val="left"/>
+          <w:tcPr/>
+          <w:p>
+            <w:pPr>
+              <w:pStyle w:val="Compact"/>
             </w:pPr>
             <w:r>
               <w:t xml:space="preserve">Operations Runbook §4</w:t>
@@ -1960,10 +1865,10 @@
       </w:tr>
       <w:tr>
         <w:tc>
-          <w:p>
-            <w:pPr>
-              <w:pStyle w:val="Compact"/>
-              <w:jc w:val="left"/>
+          <w:tcPr/>
+          <w:p>
+            <w:pPr>
+              <w:pStyle w:val="Compact"/>
             </w:pPr>
             <w:r>
               <w:t xml:space="preserve">Autosave is browser-profile-local</w:t>
@@ -1971,10 +1876,10 @@
           </w:p>
         </w:tc>
         <w:tc>
-          <w:p>
-            <w:pPr>
-              <w:pStyle w:val="Compact"/>
-              <w:jc w:val="left"/>
+          <w:tcPr/>
+          <w:p>
+            <w:pPr>
+              <w:pStyle w:val="Compact"/>
             </w:pPr>
             <w:r>
               <w:t xml:space="preserve">Switching browsers/profiles loses autosave.</w:t>
@@ -1982,10 +1887,10 @@
           </w:p>
         </w:tc>
         <w:tc>
-          <w:p>
-            <w:pPr>
-              <w:pStyle w:val="Compact"/>
-              <w:jc w:val="left"/>
+          <w:tcPr/>
+          <w:p>
+            <w:pPr>
+              <w:pStyle w:val="Compact"/>
             </w:pPr>
             <w:r>
               <w:t xml:space="preserve">Use Save As → Load.</w:t>
@@ -1993,10 +1898,10 @@
           </w:p>
         </w:tc>
         <w:tc>
-          <w:p>
-            <w:pPr>
-              <w:pStyle w:val="Compact"/>
-              <w:jc w:val="left"/>
+          <w:tcPr/>
+          <w:p>
+            <w:pPr>
+              <w:pStyle w:val="Compact"/>
             </w:pPr>
             <w:r>
               <w:t xml:space="preserve">README, Operations Runbook §5</w:t>
@@ -2006,10 +1911,10 @@
       </w:tr>
       <w:tr>
         <w:tc>
-          <w:p>
-            <w:pPr>
-              <w:pStyle w:val="Compact"/>
-              <w:jc w:val="left"/>
+          <w:tcPr/>
+          <w:p>
+            <w:pPr>
+              <w:pStyle w:val="Compact"/>
             </w:pPr>
             <w:r>
               <w:t xml:space="preserve">In-place SCP deploy</w:t>
@@ -2017,10 +1922,10 @@
           </w:p>
         </w:tc>
         <w:tc>
-          <w:p>
-            <w:pPr>
-              <w:pStyle w:val="Compact"/>
-              <w:jc w:val="left"/>
+          <w:tcPr/>
+          <w:p>
+            <w:pPr>
+              <w:pStyle w:val="Compact"/>
             </w:pPr>
             <w:r>
               <w:t xml:space="preserve">A failure mid-SCP can leave</w:t>
@@ -2043,10 +1948,10 @@
           </w:p>
         </w:tc>
         <w:tc>
-          <w:p>
-            <w:pPr>
-              <w:pStyle w:val="Compact"/>
-              <w:jc w:val="left"/>
+          <w:tcPr/>
+          <w:p>
+            <w:pPr>
+              <w:pStyle w:val="Compact"/>
             </w:pPr>
             <w:r>
               <w:t xml:space="preserve">Re-run</w:t>
@@ -2069,10 +1974,10 @@
           </w:p>
         </w:tc>
         <w:tc>
-          <w:p>
-            <w:pPr>
-              <w:pStyle w:val="Compact"/>
-              <w:jc w:val="left"/>
+          <w:tcPr/>
+          <w:p>
+            <w:pPr>
+              <w:pStyle w:val="Compact"/>
             </w:pPr>
             <w:r>
               <w:t xml:space="preserve">Operations Runbook §4, P1 above</w:t>
@@ -2082,10 +1987,10 @@
       </w:tr>
       <w:tr>
         <w:tc>
-          <w:p>
-            <w:pPr>
-              <w:pStyle w:val="Compact"/>
-              <w:jc w:val="left"/>
+          <w:tcPr/>
+          <w:p>
+            <w:pPr>
+              <w:pStyle w:val="Compact"/>
             </w:pPr>
             <w:r>
               <w:t xml:space="preserve">Site served over plain HTTP</w:t>
@@ -2093,10 +1998,10 @@
           </w:p>
         </w:tc>
         <w:tc>
-          <w:p>
-            <w:pPr>
-              <w:pStyle w:val="Compact"/>
-              <w:jc w:val="left"/>
+          <w:tcPr/>
+          <w:p>
+            <w:pPr>
+              <w:pStyle w:val="Compact"/>
             </w:pPr>
             <w:r>
               <w:t xml:space="preserve">No transport encryption for uploaded PII.</w:t>
@@ -2104,10 +2009,10 @@
           </w:p>
         </w:tc>
         <w:tc>
-          <w:p>
-            <w:pPr>
-              <w:pStyle w:val="Compact"/>
-              <w:jc w:val="left"/>
+          <w:tcPr/>
+          <w:p>
+            <w:pPr>
+              <w:pStyle w:val="Compact"/>
             </w:pPr>
             <w:r>
               <w:t xml:space="preserve">Add TLS (P1 above).</w:t>
@@ -2115,10 +2020,10 @@
           </w:p>
         </w:tc>
         <w:tc>
-          <w:p>
-            <w:pPr>
-              <w:pStyle w:val="Compact"/>
-              <w:jc w:val="left"/>
+          <w:tcPr/>
+          <w:p>
+            <w:pPr>
+              <w:pStyle w:val="Compact"/>
             </w:pPr>
             <w:r>
               <w:t xml:space="preserve">Security_Privacy_Accessibility_UX_Notes.md §1</w:t>
@@ -2128,10 +2033,10 @@
       </w:tr>
       <w:tr>
         <w:tc>
-          <w:p>
-            <w:pPr>
-              <w:pStyle w:val="Compact"/>
-              <w:jc w:val="left"/>
+          <w:tcPr/>
+          <w:p>
+            <w:pPr>
+              <w:pStyle w:val="Compact"/>
             </w:pPr>
             <w:r>
               <w:t xml:space="preserve">AI-assisted scheduling absent</w:t>
@@ -2139,10 +2044,10 @@
           </w:p>
         </w:tc>
         <w:tc>
-          <w:p>
-            <w:pPr>
-              <w:pStyle w:val="Compact"/>
-              <w:jc w:val="left"/>
+          <w:tcPr/>
+          <w:p>
+            <w:pPr>
+              <w:pStyle w:val="Compact"/>
             </w:pPr>
             <w:r>
               <w:t xml:space="preserve">D1 listed it as optional; not delivered.</w:t>
@@ -2150,10 +2055,10 @@
           </w:p>
         </w:tc>
         <w:tc>
-          <w:p>
-            <w:pPr>
-              <w:pStyle w:val="Compact"/>
-              <w:jc w:val="left"/>
+          <w:tcPr/>
+          <w:p>
+            <w:pPr>
+              <w:pStyle w:val="Compact"/>
             </w:pPr>
             <w:r>
               <w:t xml:space="preserve">None — out of scope by stakeholder agreement.</w:t>
@@ -2161,10 +2066,10 @@
           </w:p>
         </w:tc>
         <w:tc>
-          <w:p>
-            <w:pPr>
-              <w:pStyle w:val="Compact"/>
-              <w:jc w:val="left"/>
+          <w:tcPr/>
+          <w:p>
+            <w:pPr>
+              <w:pStyle w:val="Compact"/>
             </w:pPr>
             <w:r>
               <w:t xml:space="preserve">This file, "Out of scope".</w:t>
@@ -2173,23 +2078,23 @@
         </w:tc>
       </w:tr>
     </w:tbl>
+    <w:bookmarkEnd w:id="15"/>
+    <w:bookmarkStart w:id="16" w:name="where-to-find-supporting-context"/>
     <w:p>
       <w:pPr>
         <w:pStyle w:val="Heading2"/>
       </w:pPr>
-      <w:bookmarkStart w:id="28" w:name="where-to-find-supporting-context"/>
       <w:r>
         <w:t xml:space="preserve">Where to find supporting context</w:t>
       </w:r>
-      <w:bookmarkEnd w:id="28"/>
     </w:p>
     <w:p>
       <w:pPr>
+        <w:pStyle w:val="Compact"/>
         <w:numPr>
           <w:ilvl w:val="0"/>
           <w:numId w:val="1002"/>
         </w:numPr>
-        <w:pStyle w:val="Compact"/>
       </w:pPr>
       <w:r>
         <w:t xml:space="preserve">Pipeline architecture and design choices:</w:t>
@@ -2209,11 +2114,11 @@
     </w:p>
     <w:p>
       <w:pPr>
+        <w:pStyle w:val="Compact"/>
         <w:numPr>
           <w:ilvl w:val="0"/>
           <w:numId w:val="1002"/>
         </w:numPr>
-        <w:pStyle w:val="Compact"/>
       </w:pPr>
       <w:r>
         <w:t xml:space="preserve">Specific exception types and their messages:</w:t>
@@ -2236,11 +2141,11 @@
     </w:p>
     <w:p>
       <w:pPr>
+        <w:pStyle w:val="Compact"/>
         <w:numPr>
           <w:ilvl w:val="0"/>
           <w:numId w:val="1002"/>
         </w:numPr>
-        <w:pStyle w:val="Compact"/>
       </w:pPr>
       <w:r>
         <w:t xml:space="preserve">How to run / extend tests:</w:t>
@@ -2260,11 +2165,11 @@
     </w:p>
     <w:p>
       <w:pPr>
+        <w:pStyle w:val="Compact"/>
         <w:numPr>
           <w:ilvl w:val="0"/>
           <w:numId w:val="1002"/>
         </w:numPr>
-        <w:pStyle w:val="Compact"/>
       </w:pPr>
       <w:r>
         <w:t xml:space="preserve">Per-deliverable history (D1 → D7) and tagging instructions:</w:t>
@@ -2282,7 +2187,13 @@
         <w:t xml:space="preserve">.</w:t>
       </w:r>
     </w:p>
-    <w:sectPr/>
+    <w:bookmarkEnd w:id="16"/>
+    <w:bookmarkEnd w:id="17"/>
+    <w:sectPr>
+      <w:footnotePr>
+        <w:numRestart w:val="eachSect"/>
+      </w:footnotePr>
+    </w:sectPr>
   </w:body>
 </w:document>
 </file>
@@ -2313,17 +2224,14 @@
 <file path=word/numbering.xml><?xml version="1.0" encoding="utf-8"?>
 <w:numbering xmlns:w="http://schemas.openxmlformats.org/wordprocessingml/2006/main">
   <w:abstractNum w:abstractNumId="990">
-    <w:nsid w:val="2c1ae401"/>
+    <w:nsid w:val="0000A990"/>
     <w:multiLevelType w:val="multilevel"/>
     <w:lvl w:ilvl="0">
       <w:numFmt w:val="bullet"/>
       <w:lvlText w:val=" "/>
       <w:lvlJc w:val="left"/>
       <w:pPr>
-        <w:tabs>
-          <w:tab w:val="num" w:pos="0"/>
-        </w:tabs>
-        <w:ind w:left="480" w:hanging="480"/>
+        <w:ind w:left="720" w:hanging="360"/>
       </w:pPr>
     </w:lvl>
     <w:lvl w:ilvl="1">
@@ -2331,10 +2239,7 @@
       <w:lvlText w:val=" "/>
       <w:lvlJc w:val="left"/>
       <w:pPr>
-        <w:tabs>
-          <w:tab w:val="num" w:pos="720"/>
-        </w:tabs>
-        <w:ind w:left="1200" w:hanging="480"/>
+        <w:ind w:left="1440" w:hanging="360"/>
       </w:pPr>
     </w:lvl>
     <w:lvl w:ilvl="2">
@@ -2342,10 +2247,7 @@
       <w:lvlText w:val=" "/>
       <w:lvlJc w:val="left"/>
       <w:pPr>
-        <w:tabs>
-          <w:tab w:val="num" w:pos="1440"/>
-        </w:tabs>
-        <w:ind w:left="1920" w:hanging="480"/>
+        <w:ind w:left="2160" w:hanging="360"/>
       </w:pPr>
     </w:lvl>
     <w:lvl w:ilvl="3">
@@ -2353,10 +2255,7 @@
       <w:lvlText w:val=" "/>
       <w:lvlJc w:val="left"/>
       <w:pPr>
-        <w:tabs>
-          <w:tab w:val="num" w:pos="2160"/>
-        </w:tabs>
-        <w:ind w:left="2640" w:hanging="480"/>
+        <w:ind w:left="2880" w:hanging="360"/>
       </w:pPr>
     </w:lvl>
     <w:lvl w:ilvl="4">
@@ -2364,10 +2263,7 @@
       <w:lvlText w:val=" "/>
       <w:lvlJc w:val="left"/>
       <w:pPr>
-        <w:tabs>
-          <w:tab w:val="num" w:pos="2880"/>
-        </w:tabs>
-        <w:ind w:left="3360" w:hanging="480"/>
+        <w:ind w:left="3600" w:hanging="360"/>
       </w:pPr>
     </w:lvl>
     <w:lvl w:ilvl="5">
@@ -2375,10 +2271,7 @@
       <w:lvlText w:val=" "/>
       <w:lvlJc w:val="left"/>
       <w:pPr>
-        <w:tabs>
-          <w:tab w:val="num" w:pos="3600"/>
-        </w:tabs>
-        <w:ind w:left="4080" w:hanging="480"/>
+        <w:ind w:left="4320" w:hanging="360"/>
       </w:pPr>
     </w:lvl>
     <w:lvl w:ilvl="6">
@@ -2386,10 +2279,7 @@
       <w:lvlText w:val=" "/>
       <w:lvlJc w:val="left"/>
       <w:pPr>
-        <w:tabs>
-          <w:tab w:val="num" w:pos="4320"/>
-        </w:tabs>
-        <w:ind w:left="4800" w:hanging="480"/>
+        <w:ind w:left="5040" w:hanging="360"/>
       </w:pPr>
     </w:lvl>
     <w:lvl w:ilvl="7">
@@ -2397,10 +2287,7 @@
       <w:lvlText w:val=" "/>
       <w:lvlJc w:val="left"/>
       <w:pPr>
-        <w:tabs>
-          <w:tab w:val="num" w:pos="5040"/>
-        </w:tabs>
-        <w:ind w:left="5520" w:hanging="480"/>
+        <w:ind w:left="5760" w:hanging="360"/>
       </w:pPr>
     </w:lvl>
     <w:lvl w:ilvl="8">
@@ -2408,114 +2295,111 @@
       <w:lvlText w:val=" "/>
       <w:lvlJc w:val="left"/>
       <w:pPr>
-        <w:tabs>
-          <w:tab w:val="num" w:pos="5760"/>
-        </w:tabs>
-        <w:ind w:left="6240" w:hanging="480"/>
+        <w:ind w:left="6480" w:hanging="360"/>
       </w:pPr>
     </w:lvl>
   </w:abstractNum>
   <w:abstractNum w:abstractNumId="991">
-    <w:nsid w:val="ea454b4c"/>
+    <w:nsid w:val="0000A991"/>
     <w:multiLevelType w:val="multilevel"/>
     <w:lvl w:ilvl="0">
       <w:numFmt w:val="bullet"/>
-      <w:lvlText w:val="•"/>
+      <w:lvlText w:val=""/>
       <w:lvlJc w:val="left"/>
       <w:pPr>
-        <w:tabs>
-          <w:tab w:val="num" w:pos="0"/>
-        </w:tabs>
-        <w:ind w:left="480" w:hanging="480"/>
+        <w:ind w:left="720" w:hanging="360"/>
       </w:pPr>
+      <w:rPr>
+        <w:rFonts w:ascii="Symbol" w:hAnsi="Symbol" w:cs="Symbol" w:hint="default"/>
+      </w:rPr>
     </w:lvl>
     <w:lvl w:ilvl="1">
       <w:numFmt w:val="bullet"/>
-      <w:lvlText w:val="–"/>
+      <w:lvlText w:val="o"/>
       <w:lvlJc w:val="left"/>
       <w:pPr>
-        <w:tabs>
-          <w:tab w:val="num" w:pos="720"/>
-        </w:tabs>
-        <w:ind w:left="1200" w:hanging="480"/>
+        <w:ind w:left="1440" w:hanging="360"/>
       </w:pPr>
+      <w:rPr>
+        <w:rFonts w:ascii="Courier New" w:hAnsi="Courier New" w:cs="Courier New" w:hint="default"/>
+      </w:rPr>
     </w:lvl>
     <w:lvl w:ilvl="2">
       <w:numFmt w:val="bullet"/>
-      <w:lvlText w:val="•"/>
+      <w:lvlText w:val=""/>
       <w:lvlJc w:val="left"/>
       <w:pPr>
-        <w:tabs>
-          <w:tab w:val="num" w:pos="1440"/>
-        </w:tabs>
-        <w:ind w:left="1920" w:hanging="480"/>
+        <w:ind w:left="2160" w:hanging="360"/>
       </w:pPr>
+      <w:rPr>
+        <w:rFonts w:ascii="Wingdings" w:hAnsi="Wingdings" w:cs="Wingdings" w:hint="default"/>
+      </w:rPr>
     </w:lvl>
     <w:lvl w:ilvl="3">
       <w:numFmt w:val="bullet"/>
-      <w:lvlText w:val="–"/>
+      <w:lvlText w:val=""/>
       <w:lvlJc w:val="left"/>
       <w:pPr>
-        <w:tabs>
-          <w:tab w:val="num" w:pos="2160"/>
-        </w:tabs>
-        <w:ind w:left="2640" w:hanging="480"/>
+        <w:ind w:left="2880" w:hanging="360"/>
       </w:pPr>
+      <w:rPr>
+        <w:rFonts w:ascii="Symbol" w:hAnsi="Symbol" w:cs="Symbol" w:hint="default"/>
+      </w:rPr>
     </w:lvl>
     <w:lvl w:ilvl="4">
       <w:numFmt w:val="bullet"/>
-      <w:lvlText w:val="•"/>
+      <w:lvlText w:val="o"/>
       <w:lvlJc w:val="left"/>
       <w:pPr>
-        <w:tabs>
-          <w:tab w:val="num" w:pos="2880"/>
-        </w:tabs>
-        <w:ind w:left="3360" w:hanging="480"/>
+        <w:ind w:left="3600" w:hanging="360"/>
       </w:pPr>
+      <w:rPr>
+        <w:rFonts w:ascii="Courier New" w:hAnsi="Courier New" w:cs="Courier New" w:hint="default"/>
+      </w:rPr>
     </w:lvl>
     <w:lvl w:ilvl="5">
       <w:numFmt w:val="bullet"/>
-      <w:lvlText w:val="–"/>
+      <w:lvlText w:val=""/>
       <w:lvlJc w:val="left"/>
       <w:pPr>
-        <w:tabs>
-          <w:tab w:val="num" w:pos="3600"/>
-        </w:tabs>
-        <w:ind w:left="4080" w:hanging="480"/>
+        <w:ind w:left="4320" w:hanging="360"/>
       </w:pPr>
+      <w:rPr>
+        <w:rFonts w:ascii="Wingdings" w:hAnsi="Wingdings" w:cs="Wingdings" w:hint="default"/>
+      </w:rPr>
     </w:lvl>
     <w:lvl w:ilvl="6">
       <w:numFmt w:val="bullet"/>
-      <w:lvlText w:val="•"/>
+      <w:lvlText w:val=""/>
       <w:lvlJc w:val="left"/>
       <w:pPr>
-        <w:tabs>
-          <w:tab w:val="num" w:pos="4320"/>
-        </w:tabs>
-        <w:ind w:left="4800" w:hanging="480"/>
+        <w:ind w:left="5040" w:hanging="360"/>
       </w:pPr>
+      <w:rPr>
+        <w:rFonts w:ascii="Symbol" w:hAnsi="Symbol" w:cs="Symbol" w:hint="default"/>
+      </w:rPr>
     </w:lvl>
     <w:lvl w:ilvl="7">
       <w:numFmt w:val="bullet"/>
-      <w:lvlText w:val="–"/>
+      <w:lvlText w:val="o"/>
       <w:lvlJc w:val="left"/>
       <w:pPr>
-        <w:tabs>
-          <w:tab w:val="num" w:pos="5040"/>
-        </w:tabs>
-        <w:ind w:left="5520" w:hanging="480"/>
+        <w:ind w:left="5760" w:hanging="360"/>
       </w:pPr>
+      <w:rPr>
+        <w:rFonts w:ascii="Courier New" w:hAnsi="Courier New" w:cs="Courier New" w:hint="default"/>
+      </w:rPr>
     </w:lvl>
     <w:lvl w:ilvl="8">
       <w:numFmt w:val="bullet"/>
-      <w:lvlText w:val="•"/>
+      <w:lvlText w:val=""/>
       <w:lvlJc w:val="left"/>
       <w:pPr>
-        <w:tabs>
-          <w:tab w:val="num" w:pos="5760"/>
-        </w:tabs>
-        <w:ind w:left="6240" w:hanging="480"/>
+        <w:ind w:left="6480" w:hanging="360"/>
       </w:pPr>
+      <w:rPr>
+        <w:rFonts w:ascii="Wingdings" w:hAnsi="Wingdings" w:cs="Wingdings" w:hint="default"/>
+      </w:rPr>
     </w:lvl>
   </w:abstractNum>
   <w:num w:numId="1000">
@@ -2535,10 +2419,10 @@
   <w:docDefaults>
     <w:rPrDefault>
       <w:rPr>
-        <w:rFonts w:asciiTheme="minorHAnsi" w:eastAsiaTheme="minorHAnsi" w:hAnsiTheme="minorHAnsi" w:cstheme="minorBidi"/>
+        <w:rFonts w:asciiTheme="minorHAnsi" w:cstheme="minorBidi" w:eastAsiaTheme="minorEastAsia" w:hAnsiTheme="minorHAnsi"/>
         <w:sz w:val="24"/>
         <w:szCs w:val="24"/>
-        <w:lang w:val="en-US" w:eastAsia="en-US" w:bidi="ar-SA"/>
+        <w:lang w:bidi="ar-SA" w:eastAsia="zh-CN" w:val="en-US"/>
       </w:rPr>
     </w:rPrDefault>
     <w:pPrDefault>
@@ -2547,91 +2431,145 @@
       </w:pPr>
     </w:pPrDefault>
   </w:docDefaults>
-  <w:latentStyles w:defLockedState="0" w:defUIPriority="0" w:defSemiHidden="0" w:defUnhideWhenUsed="0" w:defQFormat="0" w:count="276"/>
-  <w:style w:type="paragraph" w:default="1" w:styleId="Normal">
+  <w:latentStyles w:count="276" w:defLockedState="0" w:defQFormat="0" w:defSemiHidden="0" w:defUIPriority="0" w:defUnhideWhenUsed="0"/>
+  <w:style w:default="1" w:styleId="Normal" w:type="paragraph">
     <w:name w:val="Normal"/>
     <w:qFormat/>
   </w:style>
-  <w:style w:type="paragraph" w:styleId="BodyText">
+  <w:style w:styleId="BodyText" w:type="paragraph">
     <w:name w:val="Body Text"/>
     <w:basedOn w:val="Normal"/>
     <w:link w:val="BodyTextChar"/>
+    <w:qFormat/>
     <w:pPr>
-      <w:spacing w:before="180" w:after="180"/>
+      <w:spacing w:after="180" w:before="180"/>
     </w:pPr>
-    <w:qFormat/>
-  </w:style>
-  <w:style w:type="paragraph" w:customStyle="1" w:styleId="FirstParagraph">
+  </w:style>
+  <w:style w:customStyle="1" w:styleId="FirstParagraph" w:type="paragraph">
     <w:name w:val="First Paragraph"/>
     <w:basedOn w:val="BodyText"/>
     <w:next w:val="BodyText"/>
     <w:qFormat/>
   </w:style>
-  <w:style w:type="paragraph" w:customStyle="1" w:styleId="Compact">
+  <w:style w:customStyle="1" w:styleId="Compact" w:type="paragraph">
     <w:name w:val="Compact"/>
     <w:basedOn w:val="BodyText"/>
     <w:qFormat/>
     <w:pPr>
-      <w:spacing w:before="36" w:after="36"/>
+      <w:spacing w:after="36" w:before="36"/>
     </w:pPr>
   </w:style>
-  <w:style w:type="paragraph" w:styleId="Title">
+  <w:style w:styleId="Title" w:type="paragraph">
     <w:name w:val="Title"/>
     <w:basedOn w:val="Normal"/>
     <w:next w:val="BodyText"/>
+    <w:link w:val="TitleChar"/>
+    <w:uiPriority w:val="10"/>
     <w:qFormat/>
+    <w:rsid w:val="00A10FD9"/>
     <w:pPr>
-      <w:keepNext/>
-      <w:keepLines/>
-      <w:spacing w:before="480" w:after="240"/>
+      <w:spacing w:after="80" w:line="240" w:lineRule="auto"/>
+      <w:contextualSpacing/>
       <w:jc w:val="center"/>
     </w:pPr>
     <w:rPr>
-      <w:rFonts w:asciiTheme="majorHAnsi" w:eastAsiaTheme="majorEastAsia" w:hAnsiTheme="majorHAnsi" w:cstheme="majorBidi"/>
-      <w:b/>
-      <w:bCs/>
-      <w:color w:val="345A8A" w:themeColor="accent1" w:themeShade="B5"/>
-      <w:sz w:val="36"/>
-      <w:szCs w:val="36"/>
-    </w:rPr>
-  </w:style>
-  <w:style w:type="paragraph" w:styleId="Subtitle">
+      <w:rFonts w:asciiTheme="majorHAnsi" w:cstheme="majorBidi" w:eastAsiaTheme="majorEastAsia" w:hAnsiTheme="majorHAnsi"/>
+      <w:sz w:val="56"/>
+      <w:szCs w:val="56"/>
+    </w:rPr>
+  </w:style>
+  <w:style w:customStyle="1" w:styleId="TitleChar" w:type="character">
+    <w:name w:val="Title Char"/>
+    <w:basedOn w:val="DefaultParagraphFont"/>
+    <w:link w:val="Title"/>
+    <w:uiPriority w:val="10"/>
+    <w:rsid w:val="00A10FD9"/>
+    <w:rPr>
+      <w:rFonts w:asciiTheme="majorHAnsi" w:cstheme="majorBidi" w:eastAsiaTheme="majorEastAsia" w:hAnsiTheme="majorHAnsi"/>
+      <w:sz w:val="56"/>
+      <w:szCs w:val="56"/>
+    </w:rPr>
+  </w:style>
+  <w:style w:styleId="Subtitle" w:type="paragraph">
     <w:name w:val="Subtitle"/>
+    <w:basedOn w:val="Title"/>
+    <w:next w:val="BodyText"/>
+    <w:link w:val="SubtitleChar"/>
+    <w:uiPriority w:val="11"/>
+    <w:qFormat/>
+    <w:rsid w:val="00A10FD9"/>
+    <w:pPr>
+      <w:numPr>
+        <w:ilvl w:val="1"/>
+      </w:numPr>
+    </w:pPr>
+    <w:rPr>
+      <w:rFonts w:cstheme="majorBidi" w:eastAsiaTheme="majorEastAsia"/>
+      <w:spacing w:val="15"/>
+      <w:sz w:val="28"/>
+      <w:szCs w:val="28"/>
+    </w:rPr>
+  </w:style>
+  <w:style w:customStyle="1" w:styleId="SubtitleChar" w:type="character">
+    <w:name w:val="Subtitle Char"/>
+    <w:basedOn w:val="DefaultParagraphFont"/>
+    <w:link w:val="Subtitle"/>
+    <w:uiPriority w:val="11"/>
+    <w:rsid w:val="00A10FD9"/>
+    <w:rPr>
+      <w:rFonts w:cstheme="majorBidi" w:eastAsiaTheme="majorEastAsia"/>
+      <w:color w:themeColor="text1" w:themeTint="A6" w:val="595959"/>
+      <w:spacing w:val="15"/>
+      <w:sz w:val="28"/>
+      <w:szCs w:val="28"/>
+    </w:rPr>
+  </w:style>
+  <w:style w:customStyle="1" w:styleId="Author" w:type="paragraph">
+    <w:name w:val="Author"/>
     <w:basedOn w:val="Title"/>
     <w:next w:val="BodyText"/>
     <w:qFormat/>
     <w:pPr>
       <w:keepNext/>
       <w:keepLines/>
-      <w:spacing w:before="240" w:after="240"/>
-      <w:jc w:val="center"/>
     </w:pPr>
     <w:rPr>
-      <w:sz w:val="30"/>
-      <w:szCs w:val="30"/>
-    </w:rPr>
-  </w:style>
-  <w:style w:type="paragraph" w:customStyle="1" w:styleId="Author">
-    <w:name w:val="Author"/>
+      <w:sz w:val="24"/>
+      <w:szCs w:val="24"/>
+    </w:rPr>
+  </w:style>
+  <w:style w:styleId="Date" w:type="paragraph">
+    <w:name w:val="Date"/>
+    <w:basedOn w:val="Title"/>
     <w:next w:val="BodyText"/>
     <w:qFormat/>
     <w:pPr>
       <w:keepNext/>
       <w:keepLines/>
-      <w:jc w:val="center"/>
     </w:pPr>
-  </w:style>
-  <w:style w:type="paragraph" w:styleId="Date">
-    <w:name w:val="Date"/>
-    <w:next w:val="BodyText"/>
+    <w:rPr>
+      <w:sz w:val="24"/>
+      <w:szCs w:val="24"/>
+    </w:rPr>
+  </w:style>
+  <w:style w:customStyle="1" w:styleId="AbstractTitle" w:type="paragraph">
+    <w:name w:val="Abstract Title"/>
+    <w:basedOn w:val="Normal"/>
+    <w:next w:val="Abstract"/>
     <w:qFormat/>
     <w:pPr>
       <w:keepNext/>
       <w:keepLines/>
+      <w:spacing w:after="0" w:before="300"/>
       <w:jc w:val="center"/>
     </w:pPr>
-  </w:style>
-  <w:style w:type="paragraph" w:customStyle="1" w:styleId="Abstract">
+    <w:rPr>
+      <w:b/>
+      <w:sz w:val="20"/>
+      <w:szCs w:val="20"/>
+    </w:rPr>
+  </w:style>
+  <w:style w:customStyle="1" w:styleId="Abstract" w:type="paragraph">
     <w:name w:val="Abstract"/>
     <w:basedOn w:val="Normal"/>
     <w:next w:val="BodyText"/>
@@ -2639,14 +2577,14 @@
     <w:pPr>
       <w:keepNext/>
       <w:keepLines/>
-      <w:spacing w:before="300" w:after="300"/>
+      <w:spacing w:after="300" w:before="100"/>
     </w:pPr>
     <w:rPr>
       <w:sz w:val="20"/>
       <w:szCs w:val="20"/>
     </w:rPr>
   </w:style>
-  <w:style w:type="paragraph" w:styleId="Bibliography">
+  <w:style w:styleId="Bibliography" w:type="paragraph">
     <w:name w:val="Bibliography"/>
     <w:basedOn w:val="Normal"/>
     <w:next w:val="Bibliography"/>
@@ -2654,195 +2592,325 @@
     <w:pPr/>
     <w:rPr/>
   </w:style>
-  <w:style w:type="paragraph" w:styleId="Heading1">
-    <w:name w:val="Heading 1"/>
+  <w:style w:styleId="Heading1" w:type="paragraph">
+    <w:name w:val="heading 1"/>
     <w:basedOn w:val="Normal"/>
     <w:next w:val="BodyText"/>
+    <w:link w:val="Heading1Char"/>
     <w:uiPriority w:val="9"/>
     <w:qFormat/>
+    <w:rsid w:val="00A10FD9"/>
     <w:pPr>
       <w:keepNext/>
       <w:keepLines/>
-      <w:spacing w:before="480" w:after="0"/>
+      <w:spacing w:after="80" w:before="360"/>
       <w:outlineLvl w:val="0"/>
     </w:pPr>
     <w:rPr>
-      <w:rFonts w:asciiTheme="majorHAnsi" w:eastAsiaTheme="majorEastAsia" w:hAnsiTheme="majorHAnsi" w:cstheme="majorBidi"/>
-      <w:b/>
-      <w:bCs/>
-      <w:color w:val="4F81BD" w:themeColor="accent1"/>
-      <w:sz w:val="32"/>
-      <w:szCs w:val="32"/>
-    </w:rPr>
-  </w:style>
-  <w:style w:type="paragraph" w:styleId="Heading2">
-    <w:name w:val="Heading 2"/>
+      <w:rFonts w:asciiTheme="majorHAnsi" w:cstheme="majorBidi" w:eastAsiaTheme="majorEastAsia" w:hAnsiTheme="majorHAnsi"/>
+      <w:color w:themeColor="accent1" w:themeShade="BF" w:val="0F4761"/>
+      <w:sz w:val="40"/>
+      <w:szCs w:val="40"/>
+    </w:rPr>
+  </w:style>
+  <w:style w:styleId="Heading2" w:type="paragraph">
+    <w:name w:val="heading 2"/>
     <w:basedOn w:val="Normal"/>
     <w:next w:val="BodyText"/>
+    <w:link w:val="Heading2Char"/>
     <w:uiPriority w:val="9"/>
+    <w:semiHidden/>
     <w:unhideWhenUsed/>
     <w:qFormat/>
+    <w:rsid w:val="00A10FD9"/>
     <w:pPr>
       <w:keepNext/>
       <w:keepLines/>
-      <w:spacing w:before="200" w:after="0"/>
+      <w:spacing w:after="80" w:before="160"/>
       <w:outlineLvl w:val="1"/>
     </w:pPr>
     <w:rPr>
-      <w:rFonts w:asciiTheme="majorHAnsi" w:eastAsiaTheme="majorEastAsia" w:hAnsiTheme="majorHAnsi" w:cstheme="majorBidi"/>
-      <w:b/>
-      <w:bCs/>
-      <w:color w:val="4F81BD" w:themeColor="accent1"/>
-      <w:sz w:val="28"/>
-      <w:szCs w:val="28"/>
-    </w:rPr>
-  </w:style>
-  <w:style w:type="paragraph" w:styleId="Heading3">
-    <w:name w:val="Heading 3"/>
+      <w:rFonts w:asciiTheme="majorHAnsi" w:cstheme="majorBidi" w:eastAsiaTheme="majorEastAsia" w:hAnsiTheme="majorHAnsi"/>
+      <w:color w:themeColor="accent1" w:themeShade="BF" w:val="0F4761"/>
+      <w:sz w:val="32"/>
+      <w:szCs w:val="32"/>
+    </w:rPr>
+  </w:style>
+  <w:style w:styleId="Heading3" w:type="paragraph">
+    <w:name w:val="heading 3"/>
     <w:basedOn w:val="Normal"/>
     <w:next w:val="BodyText"/>
+    <w:link w:val="Heading3Char"/>
     <w:uiPriority w:val="9"/>
+    <w:semiHidden/>
     <w:unhideWhenUsed/>
     <w:qFormat/>
+    <w:rsid w:val="00A10FD9"/>
     <w:pPr>
       <w:keepNext/>
       <w:keepLines/>
-      <w:spacing w:before="200" w:after="0"/>
+      <w:spacing w:after="80" w:before="160"/>
       <w:outlineLvl w:val="2"/>
     </w:pPr>
     <w:rPr>
-      <w:rFonts w:asciiTheme="majorHAnsi" w:eastAsiaTheme="majorEastAsia" w:hAnsiTheme="majorHAnsi" w:cstheme="majorBidi"/>
-      <w:b/>
-      <w:bCs/>
-      <w:color w:val="4F81BD" w:themeColor="accent1"/>
-      <w:sz w:val="24"/>
-      <w:szCs w:val="24"/>
-    </w:rPr>
-  </w:style>
-  <w:style w:type="paragraph" w:styleId="Heading4">
-    <w:name w:val="Heading 4"/>
+      <w:rFonts w:cstheme="majorBidi" w:eastAsiaTheme="majorEastAsia"/>
+      <w:color w:themeColor="accent1" w:themeShade="BF" w:val="0F4761"/>
+      <w:sz w:val="28"/>
+      <w:szCs w:val="28"/>
+    </w:rPr>
+  </w:style>
+  <w:style w:styleId="Heading4" w:type="paragraph">
+    <w:name w:val="heading 4"/>
     <w:basedOn w:val="Normal"/>
     <w:next w:val="BodyText"/>
+    <w:link w:val="Heading4Char"/>
     <w:uiPriority w:val="9"/>
+    <w:semiHidden/>
     <w:unhideWhenUsed/>
     <w:qFormat/>
+    <w:rsid w:val="00A10FD9"/>
     <w:pPr>
       <w:keepNext/>
       <w:keepLines/>
-      <w:spacing w:before="200" w:after="0"/>
+      <w:spacing w:after="40" w:before="80"/>
       <w:outlineLvl w:val="3"/>
     </w:pPr>
     <w:rPr>
-      <w:rFonts w:asciiTheme="majorHAnsi" w:eastAsiaTheme="majorEastAsia" w:hAnsiTheme="majorHAnsi" w:cstheme="majorBidi"/>
+      <w:rFonts w:cstheme="majorBidi" w:eastAsiaTheme="majorEastAsia"/>
       <w:i/>
-      <w:bCs/>
-      <w:color w:val="4F81BD" w:themeColor="accent1"/>
-      <w:sz w:val="24"/>
-      <w:szCs w:val="24"/>
-    </w:rPr>
-  </w:style>
-  <w:style w:type="paragraph" w:styleId="Heading5">
-    <w:name w:val="Heading 5"/>
+      <w:iCs/>
+      <w:color w:themeColor="accent1" w:themeShade="BF" w:val="0F4761"/>
+    </w:rPr>
+  </w:style>
+  <w:style w:styleId="Heading5" w:type="paragraph">
+    <w:name w:val="heading 5"/>
     <w:basedOn w:val="Normal"/>
     <w:next w:val="BodyText"/>
+    <w:link w:val="Heading5Char"/>
     <w:uiPriority w:val="9"/>
+    <w:semiHidden/>
     <w:unhideWhenUsed/>
     <w:qFormat/>
+    <w:rsid w:val="00A10FD9"/>
     <w:pPr>
       <w:keepNext/>
       <w:keepLines/>
-      <w:spacing w:before="200" w:after="0"/>
+      <w:spacing w:after="40" w:before="80"/>
       <w:outlineLvl w:val="4"/>
     </w:pPr>
     <w:rPr>
-      <w:rFonts w:asciiTheme="majorHAnsi" w:eastAsiaTheme="majorEastAsia" w:hAnsiTheme="majorHAnsi" w:cstheme="majorBidi"/>
-      <w:iCs/>
-      <w:color w:val="4F81BD" w:themeColor="accent1"/>
-      <w:sz w:val="24"/>
-      <w:szCs w:val="24"/>
-    </w:rPr>
-  </w:style>
-  <w:style w:type="paragraph" w:styleId="Heading6">
-    <w:name w:val="Heading 6"/>
+      <w:rFonts w:cstheme="majorBidi" w:eastAsiaTheme="majorEastAsia"/>
+      <w:color w:themeColor="accent1" w:themeShade="BF" w:val="0F4761"/>
+    </w:rPr>
+  </w:style>
+  <w:style w:styleId="Heading6" w:type="paragraph">
+    <w:name w:val="heading 6"/>
     <w:basedOn w:val="Normal"/>
     <w:next w:val="BodyText"/>
+    <w:link w:val="Heading6Char"/>
     <w:uiPriority w:val="9"/>
+    <w:semiHidden/>
     <w:unhideWhenUsed/>
     <w:qFormat/>
+    <w:rsid w:val="00A10FD9"/>
     <w:pPr>
       <w:keepNext/>
       <w:keepLines/>
-      <w:spacing w:before="200" w:after="0"/>
+      <w:spacing w:after="0" w:before="40"/>
       <w:outlineLvl w:val="5"/>
     </w:pPr>
     <w:rPr>
-      <w:rFonts w:asciiTheme="majorHAnsi" w:eastAsiaTheme="majorEastAsia" w:hAnsiTheme="majorHAnsi" w:cstheme="majorBidi"/>
-      <w:color w:val="4F81BD" w:themeColor="accent1"/>
-      <w:sz w:val="24"/>
-      <w:szCs w:val="24"/>
-    </w:rPr>
-  </w:style>
-  <w:style w:type="paragraph" w:styleId="Heading7">
-    <w:name w:val="Heading 7"/>
+      <w:rFonts w:cstheme="majorBidi" w:eastAsiaTheme="majorEastAsia"/>
+      <w:i/>
+      <w:iCs/>
+      <w:color w:themeColor="text1" w:themeTint="A6" w:val="595959"/>
+    </w:rPr>
+  </w:style>
+  <w:style w:styleId="Heading7" w:type="paragraph">
+    <w:name w:val="heading 7"/>
     <w:basedOn w:val="Normal"/>
     <w:next w:val="BodyText"/>
+    <w:link w:val="Heading7Char"/>
     <w:uiPriority w:val="9"/>
+    <w:semiHidden/>
     <w:unhideWhenUsed/>
     <w:qFormat/>
+    <w:rsid w:val="00A10FD9"/>
     <w:pPr>
       <w:keepNext/>
       <w:keepLines/>
-      <w:spacing w:before="200" w:after="0"/>
+      <w:spacing w:after="0" w:before="40"/>
       <w:outlineLvl w:val="6"/>
     </w:pPr>
     <w:rPr>
-      <w:rFonts w:asciiTheme="majorHAnsi" w:eastAsiaTheme="majorEastAsia" w:hAnsiTheme="majorHAnsi" w:cstheme="majorBidi"/>
-      <w:color w:val="4F81BD" w:themeColor="accent1"/>
-      <w:sz w:val="24"/>
-      <w:szCs w:val="24"/>
-    </w:rPr>
-  </w:style>
-  <w:style w:type="paragraph" w:styleId="Heading8">
-    <w:name w:val="Heading 8"/>
+      <w:rFonts w:cstheme="majorBidi" w:eastAsiaTheme="majorEastAsia"/>
+      <w:color w:themeColor="text1" w:themeTint="A6" w:val="595959"/>
+    </w:rPr>
+  </w:style>
+  <w:style w:styleId="Heading8" w:type="paragraph">
+    <w:name w:val="heading 8"/>
     <w:basedOn w:val="Normal"/>
     <w:next w:val="BodyText"/>
+    <w:link w:val="Heading8Char"/>
     <w:uiPriority w:val="9"/>
+    <w:semiHidden/>
     <w:unhideWhenUsed/>
     <w:qFormat/>
+    <w:rsid w:val="00A10FD9"/>
     <w:pPr>
       <w:keepNext/>
       <w:keepLines/>
-      <w:spacing w:before="200" w:after="0"/>
+      <w:spacing w:after="0"/>
       <w:outlineLvl w:val="7"/>
     </w:pPr>
     <w:rPr>
-      <w:rFonts w:asciiTheme="majorHAnsi" w:eastAsiaTheme="majorEastAsia" w:hAnsiTheme="majorHAnsi" w:cstheme="majorBidi"/>
-      <w:color w:val="4F81BD" w:themeColor="accent1"/>
-      <w:sz w:val="24"/>
-      <w:szCs w:val="24"/>
-    </w:rPr>
-  </w:style>
-  <w:style w:type="paragraph" w:styleId="Heading9">
-    <w:name w:val="Heading 9"/>
+      <w:rFonts w:cstheme="majorBidi" w:eastAsiaTheme="majorEastAsia"/>
+      <w:i/>
+      <w:iCs/>
+      <w:color w:themeColor="text1" w:themeTint="D8" w:val="272727"/>
+    </w:rPr>
+  </w:style>
+  <w:style w:styleId="Heading9" w:type="paragraph">
+    <w:name w:val="heading 9"/>
     <w:basedOn w:val="Normal"/>
     <w:next w:val="BodyText"/>
+    <w:link w:val="Heading9Char"/>
     <w:uiPriority w:val="9"/>
+    <w:semiHidden/>
     <w:unhideWhenUsed/>
     <w:qFormat/>
+    <w:rsid w:val="00A10FD9"/>
     <w:pPr>
       <w:keepNext/>
       <w:keepLines/>
-      <w:spacing w:before="200" w:after="0"/>
+      <w:spacing w:after="0"/>
       <w:outlineLvl w:val="8"/>
     </w:pPr>
     <w:rPr>
-      <w:rFonts w:asciiTheme="majorHAnsi" w:eastAsiaTheme="majorEastAsia" w:hAnsiTheme="majorHAnsi" w:cstheme="majorBidi"/>
-      <w:color w:val="4F81BD" w:themeColor="accent1"/>
-      <w:sz w:val="24"/>
-      <w:szCs w:val="24"/>
-    </w:rPr>
-  </w:style>
-  <w:style w:type="paragraph" w:styleId="BlockText">
+      <w:rFonts w:cstheme="majorBidi" w:eastAsiaTheme="majorEastAsia"/>
+      <w:color w:themeColor="text1" w:themeTint="D8" w:val="272727"/>
+    </w:rPr>
+  </w:style>
+  <w:style w:customStyle="1" w:styleId="Heading1Char" w:type="character">
+    <w:name w:val="Heading 1 Char"/>
+    <w:basedOn w:val="DefaultParagraphFont"/>
+    <w:link w:val="Heading1"/>
+    <w:uiPriority w:val="9"/>
+    <w:rsid w:val="00A10FD9"/>
+    <w:rPr>
+      <w:rFonts w:asciiTheme="majorHAnsi" w:cstheme="majorBidi" w:eastAsiaTheme="majorEastAsia" w:hAnsiTheme="majorHAnsi"/>
+      <w:color w:themeColor="accent1" w:themeShade="BF" w:val="0F4761"/>
+      <w:sz w:val="40"/>
+      <w:szCs w:val="40"/>
+    </w:rPr>
+  </w:style>
+  <w:style w:customStyle="1" w:styleId="Heading2Char" w:type="character">
+    <w:name w:val="Heading 2 Char"/>
+    <w:basedOn w:val="DefaultParagraphFont"/>
+    <w:link w:val="Heading2"/>
+    <w:uiPriority w:val="9"/>
+    <w:semiHidden/>
+    <w:rsid w:val="00A10FD9"/>
+    <w:rPr>
+      <w:rFonts w:asciiTheme="majorHAnsi" w:cstheme="majorBidi" w:eastAsiaTheme="majorEastAsia" w:hAnsiTheme="majorHAnsi"/>
+      <w:color w:themeColor="accent1" w:themeShade="BF" w:val="0F4761"/>
+      <w:sz w:val="32"/>
+      <w:szCs w:val="32"/>
+    </w:rPr>
+  </w:style>
+  <w:style w:customStyle="1" w:styleId="Heading3Char" w:type="character">
+    <w:name w:val="Heading 3 Char"/>
+    <w:basedOn w:val="DefaultParagraphFont"/>
+    <w:link w:val="Heading3"/>
+    <w:uiPriority w:val="9"/>
+    <w:semiHidden/>
+    <w:rsid w:val="00A10FD9"/>
+    <w:rPr>
+      <w:rFonts w:cstheme="majorBidi" w:eastAsiaTheme="majorEastAsia"/>
+      <w:color w:themeColor="accent1" w:themeShade="BF" w:val="0F4761"/>
+      <w:sz w:val="28"/>
+      <w:szCs w:val="28"/>
+    </w:rPr>
+  </w:style>
+  <w:style w:customStyle="1" w:styleId="Heading4Char" w:type="character">
+    <w:name w:val="Heading 4 Char"/>
+    <w:basedOn w:val="DefaultParagraphFont"/>
+    <w:link w:val="Heading4"/>
+    <w:uiPriority w:val="9"/>
+    <w:semiHidden/>
+    <w:rsid w:val="00A10FD9"/>
+    <w:rPr>
+      <w:rFonts w:cstheme="majorBidi" w:eastAsiaTheme="majorEastAsia"/>
+      <w:i/>
+      <w:iCs/>
+      <w:color w:themeColor="accent1" w:themeShade="BF" w:val="0F4761"/>
+    </w:rPr>
+  </w:style>
+  <w:style w:customStyle="1" w:styleId="Heading5Char" w:type="character">
+    <w:name w:val="Heading 5 Char"/>
+    <w:basedOn w:val="DefaultParagraphFont"/>
+    <w:link w:val="Heading5"/>
+    <w:uiPriority w:val="9"/>
+    <w:semiHidden/>
+    <w:rsid w:val="00A10FD9"/>
+    <w:rPr>
+      <w:rFonts w:cstheme="majorBidi" w:eastAsiaTheme="majorEastAsia"/>
+      <w:color w:themeColor="accent1" w:themeShade="BF" w:val="0F4761"/>
+    </w:rPr>
+  </w:style>
+  <w:style w:customStyle="1" w:styleId="Heading6Char" w:type="character">
+    <w:name w:val="Heading 6 Char"/>
+    <w:basedOn w:val="DefaultParagraphFont"/>
+    <w:link w:val="Heading6"/>
+    <w:uiPriority w:val="9"/>
+    <w:semiHidden/>
+    <w:rsid w:val="00A10FD9"/>
+    <w:rPr>
+      <w:rFonts w:cstheme="majorBidi" w:eastAsiaTheme="majorEastAsia"/>
+      <w:i/>
+      <w:iCs/>
+      <w:color w:themeColor="text1" w:themeTint="A6" w:val="595959"/>
+    </w:rPr>
+  </w:style>
+  <w:style w:customStyle="1" w:styleId="Heading7Char" w:type="character">
+    <w:name w:val="Heading 7 Char"/>
+    <w:basedOn w:val="DefaultParagraphFont"/>
+    <w:link w:val="Heading7"/>
+    <w:uiPriority w:val="9"/>
+    <w:semiHidden/>
+    <w:rsid w:val="00A10FD9"/>
+    <w:rPr>
+      <w:rFonts w:cstheme="majorBidi" w:eastAsiaTheme="majorEastAsia"/>
+      <w:color w:themeColor="text1" w:themeTint="A6" w:val="595959"/>
+    </w:rPr>
+  </w:style>
+  <w:style w:customStyle="1" w:styleId="Heading8Char" w:type="character">
+    <w:name w:val="Heading 8 Char"/>
+    <w:basedOn w:val="DefaultParagraphFont"/>
+    <w:link w:val="Heading8"/>
+    <w:uiPriority w:val="9"/>
+    <w:semiHidden/>
+    <w:rsid w:val="00A10FD9"/>
+    <w:rPr>
+      <w:rFonts w:cstheme="majorBidi" w:eastAsiaTheme="majorEastAsia"/>
+      <w:i/>
+      <w:iCs/>
+      <w:color w:themeColor="text1" w:themeTint="D8" w:val="272727"/>
+    </w:rPr>
+  </w:style>
+  <w:style w:customStyle="1" w:styleId="Heading9Char" w:type="character">
+    <w:name w:val="Heading 9 Char"/>
+    <w:basedOn w:val="DefaultParagraphFont"/>
+    <w:link w:val="Heading9"/>
+    <w:uiPriority w:val="9"/>
+    <w:semiHidden/>
+    <w:rsid w:val="00A10FD9"/>
+    <w:rPr>
+      <w:rFonts w:cstheme="majorBidi" w:eastAsiaTheme="majorEastAsia"/>
+      <w:color w:themeColor="text1" w:themeTint="D8" w:val="272727"/>
+    </w:rPr>
+  </w:style>
+  <w:style w:styleId="BlockText" w:type="paragraph">
     <w:name w:val="Block Text"/>
     <w:basedOn w:val="BodyText"/>
     <w:next w:val="BodyText"/>
@@ -2850,11 +2918,11 @@
     <w:unhideWhenUsed/>
     <w:qFormat/>
     <w:pPr>
-      <w:spacing w:before="100" w:after="100"/>
+      <w:spacing w:after="100" w:before="100"/>
       <w:ind w:firstLine="0" w:left="480" w:right="480"/>
     </w:pPr>
   </w:style>
-  <w:style w:type="paragraph" w:styleId="FootnoteText">
+  <w:style w:styleId="FootnoteText" w:type="paragraph">
     <w:name w:val="Footnote Text"/>
     <w:basedOn w:val="Normal"/>
     <w:next w:val="FootnoteText"/>
@@ -2862,28 +2930,48 @@
     <w:unhideWhenUsed/>
     <w:qFormat/>
   </w:style>
-  <w:style w:type="character" w:default="1" w:styleId="DefaultParagraphFont">
+  <w:style w:styleId="FootnoteBlockText" w:type="paragraph">
+    <w:name w:val="Footnote Block Text"/>
+    <w:basedOn w:val="FootnoteText"/>
+    <w:next w:val="FootnoteText"/>
+    <w:uiPriority w:val="9"/>
+    <w:unhideWhenUsed/>
+    <w:qFormat/>
+    <w:pPr>
+      <w:spacing w:after="100" w:before="100"/>
+      <w:ind w:firstLine="0" w:left="480" w:right="480"/>
+    </w:pPr>
+  </w:style>
+  <w:style w:default="1" w:styleId="DefaultParagraphFont" w:type="character">
     <w:name w:val="Default Paragraph Font"/>
     <w:semiHidden/>
     <w:unhideWhenUsed/>
   </w:style>
-  <w:style w:type="table" w:default="1" w:styleId="Table">
+  <w:style w:default="1" w:styleId="Table" w:type="table">
     <w:name w:val="Table"/>
     <w:basedOn w:val="TableNormal"/>
     <w:semiHidden/>
     <w:unhideWhenUsed/>
     <w:qFormat/>
     <w:tblPr>
-      <w:tblInd w:w="0" w:type="dxa"/>
+      <w:tblInd w:type="dxa" w:w="0"/>
       <w:tblCellMar>
-        <w:top w:w="0" w:type="dxa"/>
-        <w:left w:w="108" w:type="dxa"/>
-        <w:bottom w:w="0" w:type="dxa"/>
-        <w:right w:w="108" w:type="dxa"/>
+        <w:top w:type="dxa" w:w="0"/>
+        <w:left w:type="dxa" w:w="108"/>
+        <w:bottom w:type="dxa" w:w="0"/>
+        <w:right w:type="dxa" w:w="108"/>
       </w:tblCellMar>
     </w:tblPr>
-  </w:style>
-  <w:style w:type="paragraph" w:customStyle="1" w:styleId="DefinitionTerm">
+    <w:tblStylePr w:type="firstRow">
+      <w:tcPr>
+        <w:tcBorders>
+          <w:bottom w:val="single"/>
+        </w:tcBorders>
+        <w:vAlign w:val="bottom"/>
+      </w:tcPr>
+    </w:tblStylePr>
+  </w:style>
+  <w:style w:customStyle="1" w:styleId="DefinitionTerm" w:type="paragraph">
     <w:name w:val="Definition Term"/>
     <w:basedOn w:val="Normal"/>
     <w:next w:val="Definition"/>
@@ -2896,49 +2984,49 @@
       <w:b/>
     </w:rPr>
   </w:style>
-  <w:style w:type="paragraph" w:customStyle="1" w:styleId="Definition">
+  <w:style w:customStyle="1" w:styleId="Definition" w:type="paragraph">
     <w:name w:val="Definition"/>
     <w:basedOn w:val="Normal"/>
   </w:style>
-  <w:style w:type="paragraph" w:styleId="Caption">
+  <w:style w:styleId="Caption" w:type="paragraph">
     <w:name w:val="Caption"/>
     <w:basedOn w:val="Normal"/>
     <w:link w:val="BodyTextChar"/>
     <w:pPr>
-      <w:spacing w:before="0" w:after="120"/>
+      <w:spacing w:after="120" w:before="0"/>
     </w:pPr>
     <w:rPr>
       <w:i/>
     </w:rPr>
   </w:style>
-  <w:style w:type="paragraph" w:customStyle="1" w:styleId="TableCaption">
+  <w:style w:customStyle="1" w:styleId="TableCaption" w:type="paragraph">
     <w:name w:val="Table Caption"/>
     <w:basedOn w:val="Caption"/>
     <w:pPr>
       <w:keepNext/>
     </w:pPr>
   </w:style>
-  <w:style w:type="paragraph" w:customStyle="1" w:styleId="ImageCaption">
+  <w:style w:customStyle="1" w:styleId="ImageCaption" w:type="paragraph">
     <w:name w:val="Image Caption"/>
     <w:basedOn w:val="Caption"/>
   </w:style>
-  <w:style w:type="paragraph" w:customStyle="1" w:styleId="Figure">
+  <w:style w:customStyle="1" w:styleId="Figure" w:type="paragraph">
     <w:name w:val="Figure"/>
     <w:basedOn w:val="Normal"/>
   </w:style>
-  <w:style w:type="paragraph" w:customStyle="1" w:styleId="CaptionedFigure">
+  <w:style w:customStyle="1" w:styleId="CaptionedFigure" w:type="paragraph">
     <w:name w:val="Captioned Figure"/>
     <w:basedOn w:val="Figure"/>
     <w:pPr>
       <w:keepNext/>
     </w:pPr>
   </w:style>
-  <w:style w:type="character" w:customStyle="1" w:styleId="BodyTextChar">
+  <w:style w:customStyle="1" w:styleId="BodyTextChar" w:type="character">
     <w:name w:val="Body Text Char"/>
     <w:basedOn w:val="DefaultParagraphFont"/>
     <w:link w:val="BodyText"/>
   </w:style>
-  <w:style w:type="character" w:customStyle="1" w:styleId="VerbatimChar">
+  <w:style w:customStyle="1" w:styleId="VerbatimChar" w:type="character">
     <w:name w:val="Verbatim Char"/>
     <w:basedOn w:val="BodyTextChar"/>
     <w:rPr>
@@ -2946,21 +3034,25 @@
       <w:sz w:val="22"/>
     </w:rPr>
   </w:style>
-  <w:style w:type="character" w:styleId="FootnoteReference">
+  <w:style w:customStyle="1" w:styleId="SectionNumber" w:type="character">
+    <w:name w:val="Section Number"/>
+    <w:basedOn w:val="BodyTextChar"/>
+  </w:style>
+  <w:style w:styleId="FootnoteReference" w:type="character">
     <w:name w:val="Footnote Reference"/>
     <w:basedOn w:val="BodyTextChar"/>
     <w:rPr>
       <w:vertAlign w:val="superscript"/>
     </w:rPr>
   </w:style>
-  <w:style w:type="character" w:styleId="Hyperlink">
+  <w:style w:styleId="Hyperlink" w:type="character">
     <w:name w:val="Hyperlink"/>
     <w:basedOn w:val="BodyTextChar"/>
     <w:rPr>
-      <w:color w:val="4F81BD" w:themeColor="accent1"/>
-    </w:rPr>
-  </w:style>
-  <w:style w:type="paragraph" w:styleId="TOCHeading">
+      <w:color w:themeColor="accent1" w:val="4F81BD"/>
+    </w:rPr>
+  </w:style>
+  <w:style w:styleId="TOCHeading" w:type="paragraph">
     <w:name w:val="TOC Heading"/>
     <w:basedOn w:val="Heading1"/>
     <w:next w:val="BodyText"/>
@@ -2972,10 +3064,10 @@
       <w:outlineLvl w:val="9"/>
     </w:pPr>
     <w:rPr>
-      <w:rFonts w:asciiTheme="majorHAnsi" w:eastAsiaTheme="majorEastAsia" w:hAnsiTheme="majorHAnsi" w:cstheme="majorBidi"/>
+      <w:rFonts w:asciiTheme="majorHAnsi" w:cstheme="majorBidi" w:eastAsiaTheme="majorEastAsia" w:hAnsiTheme="majorHAnsi"/>
       <w:b w:val="0"/>
       <w:bCs w:val="0"/>
-      <w:color w:val="365F91" w:themeColor="accent1" w:themeShade="BF"/>
+      <w:color w:themeColor="accent1" w:themeShade="BF" w:val="365F91"/>
     </w:rPr>
   </w:style>
   <w:style w:type="paragraph" w:customStyle="1" w:styleId="SourceCode">
@@ -2990,8 +3082,8 @@
     <w:name w:val="KeywordTok"/>
     <w:basedOn w:val="VerbatimChar"/>
     <w:rPr>
+      <w:b/>
       <w:color w:val="007020"/>
-      <w:b/>
     </w:rPr>
   </w:style>
   <w:style w:type="character" w:customStyle="1" w:styleId="DataTypeTok">
@@ -3067,40 +3159,43 @@
   <w:style w:type="character" w:customStyle="1" w:styleId="ImportTok">
     <w:name w:val="ImportTok"/>
     <w:basedOn w:val="VerbatimChar"/>
-    <w:rPr/>
+    <w:rPr>
+      <w:b/>
+      <w:color w:val="008000"/>
+    </w:rPr>
   </w:style>
   <w:style w:type="character" w:customStyle="1" w:styleId="CommentTok">
     <w:name w:val="CommentTok"/>
     <w:basedOn w:val="VerbatimChar"/>
     <w:rPr>
+      <w:i/>
       <w:color w:val="60a0b0"/>
-      <w:i/>
     </w:rPr>
   </w:style>
   <w:style w:type="character" w:customStyle="1" w:styleId="DocumentationTok">
     <w:name w:val="DocumentationTok"/>
     <w:basedOn w:val="VerbatimChar"/>
     <w:rPr>
+      <w:i/>
       <w:color w:val="ba2121"/>
-      <w:i/>
     </w:rPr>
   </w:style>
   <w:style w:type="character" w:customStyle="1" w:styleId="AnnotationTok">
     <w:name w:val="AnnotationTok"/>
     <w:basedOn w:val="VerbatimChar"/>
     <w:rPr>
-      <w:color w:val="60a0b0"/>
       <w:b/>
       <w:i/>
+      <w:color w:val="60a0b0"/>
     </w:rPr>
   </w:style>
   <w:style w:type="character" w:customStyle="1" w:styleId="CommentVarTok">
     <w:name w:val="CommentVarTok"/>
     <w:basedOn w:val="VerbatimChar"/>
     <w:rPr>
-      <w:color w:val="60a0b0"/>
       <w:b/>
       <w:i/>
+      <w:color w:val="60a0b0"/>
     </w:rPr>
   </w:style>
   <w:style w:type="character" w:customStyle="1" w:styleId="OtherTok">
@@ -3128,8 +3223,8 @@
     <w:name w:val="ControlFlowTok"/>
     <w:basedOn w:val="VerbatimChar"/>
     <w:rPr>
+      <w:b/>
       <w:color w:val="007020"/>
-      <w:b/>
     </w:rPr>
   </w:style>
   <w:style w:type="character" w:customStyle="1" w:styleId="OperatorTok">
@@ -3142,7 +3237,9 @@
   <w:style w:type="character" w:customStyle="1" w:styleId="BuiltInTok">
     <w:name w:val="BuiltInTok"/>
     <w:basedOn w:val="VerbatimChar"/>
-    <w:rPr/>
+    <w:rPr>
+      <w:color w:val="008000"/>
+    </w:rPr>
   </w:style>
   <w:style w:type="character" w:customStyle="1" w:styleId="ExtensionTok">
     <w:name w:val="ExtensionTok"/>
@@ -3172,34 +3269,34 @@
     <w:name w:val="InformationTok"/>
     <w:basedOn w:val="VerbatimChar"/>
     <w:rPr>
-      <w:color w:val="60a0b0"/>
       <w:b/>
       <w:i/>
+      <w:color w:val="60a0b0"/>
     </w:rPr>
   </w:style>
   <w:style w:type="character" w:customStyle="1" w:styleId="WarningTok">
     <w:name w:val="WarningTok"/>
     <w:basedOn w:val="VerbatimChar"/>
     <w:rPr>
-      <w:color w:val="60a0b0"/>
       <w:b/>
       <w:i/>
+      <w:color w:val="60a0b0"/>
     </w:rPr>
   </w:style>
   <w:style w:type="character" w:customStyle="1" w:styleId="AlertTok">
     <w:name w:val="AlertTok"/>
     <w:basedOn w:val="VerbatimChar"/>
     <w:rPr>
+      <w:b/>
       <w:color w:val="ff0000"/>
-      <w:b/>
     </w:rPr>
   </w:style>
   <w:style w:type="character" w:customStyle="1" w:styleId="ErrorTok">
     <w:name w:val="ErrorTok"/>
     <w:basedOn w:val="VerbatimChar"/>
     <w:rPr>
+      <w:b/>
       <w:color w:val="ff0000"/>
-      <w:b/>
     </w:rPr>
   </w:style>
   <w:style w:type="character" w:customStyle="1" w:styleId="NormalTok">
@@ -3221,44 +3318,44 @@
         <a:sysClr val="window" lastClr="FFFFFF"/>
       </a:lt1>
       <a:dk2>
-        <a:srgbClr val="1F497D"/>
+        <a:srgbClr val="0E2841"/>
       </a:dk2>
       <a:lt2>
-        <a:srgbClr val="EEECE1"/>
+        <a:srgbClr val="E8E8E8"/>
       </a:lt2>
       <a:accent1>
-        <a:srgbClr val="4F81BD"/>
+        <a:srgbClr val="156082"/>
       </a:accent1>
       <a:accent2>
-        <a:srgbClr val="C0504D"/>
+        <a:srgbClr val="E97132"/>
       </a:accent2>
       <a:accent3>
-        <a:srgbClr val="9BBB59"/>
+        <a:srgbClr val="196B24"/>
       </a:accent3>
       <a:accent4>
-        <a:srgbClr val="8064A2"/>
+        <a:srgbClr val="0F9ED5"/>
       </a:accent4>
       <a:accent5>
-        <a:srgbClr val="4BACC6"/>
+        <a:srgbClr val="A02B93"/>
       </a:accent5>
       <a:accent6>
-        <a:srgbClr val="F79646"/>
+        <a:srgbClr val="4EA72E"/>
       </a:accent6>
       <a:hlink>
-        <a:srgbClr val="0000FF"/>
+        <a:srgbClr val="467886"/>
       </a:hlink>
       <a:folHlink>
-        <a:srgbClr val="800080"/>
+        <a:srgbClr val="96607D"/>
       </a:folHlink>
     </a:clrScheme>
     <a:fontScheme name="Office">
       <a:majorFont>
-        <a:latin typeface="Calibri"/>
+        <a:latin typeface="Aptos Display" panose="02110004020202020204"/>
         <a:ea typeface=""/>
         <a:cs typeface=""/>
-        <a:font script="Jpan" typeface="ＭＳ ゴシック"/>
+        <a:font script="Jpan" typeface="游ゴシック Light"/>
         <a:font script="Hang" typeface="맑은 고딕"/>
-        <a:font script="Hans" typeface="宋体"/>
+        <a:font script="Hans" typeface="等线 Light"/>
         <a:font script="Hant" typeface="新細明體"/>
         <a:font script="Arab" typeface="Times New Roman"/>
         <a:font script="Hebr" typeface="Times New Roman"/>
@@ -3285,14 +3382,32 @@
         <a:font script="Mong" typeface="Mongolian Baiti"/>
         <a:font script="Viet" typeface="Times New Roman"/>
         <a:font script="Uigh" typeface="Microsoft Uighur"/>
+        <a:font script="Geor" typeface="Sylfaen"/>
+        <a:font script="Armn" typeface="Arial"/>
+        <a:font script="Bugi" typeface="Leelawadee UI"/>
+        <a:font script="Bopo" typeface="Microsoft JhengHei"/>
+        <a:font script="Java" typeface="Javanese Text"/>
+        <a:font script="Lisu" typeface="Segoe UI"/>
+        <a:font script="Mymr" typeface="Myanmar Text"/>
+        <a:font script="Nkoo" typeface="Ebrima"/>
+        <a:font script="Olck" typeface="Nirmala UI"/>
+        <a:font script="Osma" typeface="Ebrima"/>
+        <a:font script="Phag" typeface="Phagspa"/>
+        <a:font script="Syrn" typeface="Estrangelo Edessa"/>
+        <a:font script="Syrj" typeface="Estrangelo Edessa"/>
+        <a:font script="Syre" typeface="Estrangelo Edessa"/>
+        <a:font script="Sora" typeface="Nirmala UI"/>
+        <a:font script="Tale" typeface="Microsoft Tai Le"/>
+        <a:font script="Talu" typeface="Microsoft New Tai Lue"/>
+        <a:font script="Tfng" typeface="Ebrima"/>
       </a:majorFont>
       <a:minorFont>
-        <a:latin typeface="Cambria"/>
+        <a:latin typeface="Aptos" panose="02110004020202020204"/>
         <a:ea typeface=""/>
         <a:cs typeface=""/>
-        <a:font script="Jpan" typeface="ＭＳ 明朝"/>
+        <a:font script="Jpan" typeface="游明朝"/>
         <a:font script="Hang" typeface="맑은 고딕"/>
-        <a:font script="Hans" typeface="宋体"/>
+        <a:font script="Hans" typeface="等线"/>
         <a:font script="Hant" typeface="新細明體"/>
         <a:font script="Arab" typeface="Arial"/>
         <a:font script="Hebr" typeface="Arial"/>
@@ -3319,6 +3434,24 @@
         <a:font script="Mong" typeface="Mongolian Baiti"/>
         <a:font script="Viet" typeface="Arial"/>
         <a:font script="Uigh" typeface="Microsoft Uighur"/>
+        <a:font script="Geor" typeface="Sylfaen"/>
+        <a:font script="Armn" typeface="Arial"/>
+        <a:font script="Bugi" typeface="Leelawadee UI"/>
+        <a:font script="Bopo" typeface="Microsoft JhengHei"/>
+        <a:font script="Java" typeface="Javanese Text"/>
+        <a:font script="Lisu" typeface="Segoe UI"/>
+        <a:font script="Mymr" typeface="Myanmar Text"/>
+        <a:font script="Nkoo" typeface="Ebrima"/>
+        <a:font script="Olck" typeface="Nirmala UI"/>
+        <a:font script="Osma" typeface="Ebrima"/>
+        <a:font script="Phag" typeface="Phagspa"/>
+        <a:font script="Syrn" typeface="Estrangelo Edessa"/>
+        <a:font script="Syrj" typeface="Estrangelo Edessa"/>
+        <a:font script="Syre" typeface="Estrangelo Edessa"/>
+        <a:font script="Sora" typeface="Nirmala UI"/>
+        <a:font script="Tale" typeface="Microsoft Tai Le"/>
+        <a:font script="Talu" typeface="Microsoft New Tai Lue"/>
+        <a:font script="Tfng" typeface="Ebrima"/>
       </a:minorFont>
     </a:fontScheme>
     <a:fmtScheme name="Office">
@@ -3330,200 +3463,141 @@
           <a:gsLst>
             <a:gs pos="0">
               <a:schemeClr val="phClr">
-                <a:tint val="50000"/>
-                <a:satMod val="300000"/>
+                <a:lumMod val="110000"/>
+                <a:satMod val="105000"/>
+                <a:tint val="67000"/>
               </a:schemeClr>
             </a:gs>
-            <a:gs pos="35000">
+            <a:gs pos="50000">
               <a:schemeClr val="phClr">
-                <a:tint val="37000"/>
-                <a:satMod val="300000"/>
+                <a:lumMod val="105000"/>
+                <a:satMod val="103000"/>
+                <a:tint val="73000"/>
               </a:schemeClr>
             </a:gs>
             <a:gs pos="100000">
               <a:schemeClr val="phClr">
-                <a:tint val="15000"/>
-                <a:satMod val="350000"/>
+                <a:lumMod val="105000"/>
+                <a:satMod val="109000"/>
+                <a:tint val="81000"/>
               </a:schemeClr>
             </a:gs>
           </a:gsLst>
-          <a:lin ang="16200000" scaled="1"/>
+          <a:lin ang="5400000" scaled="0"/>
         </a:gradFill>
         <a:gradFill rotWithShape="1">
           <a:gsLst>
             <a:gs pos="0">
               <a:schemeClr val="phClr">
-                <a:tint val="100000"/>
+                <a:satMod val="103000"/>
+                <a:lumMod val="102000"/>
+                <a:tint val="94000"/>
+              </a:schemeClr>
+            </a:gs>
+            <a:gs pos="50000">
+              <a:schemeClr val="phClr">
+                <a:satMod val="110000"/>
+                <a:lumMod val="100000"/>
                 <a:shade val="100000"/>
-                <a:satMod val="130000"/>
               </a:schemeClr>
             </a:gs>
             <a:gs pos="100000">
               <a:schemeClr val="phClr">
-                <a:tint val="50000"/>
-                <a:shade val="100000"/>
-                <a:satMod val="350000"/>
+                <a:lumMod val="99000"/>
+                <a:satMod val="120000"/>
+                <a:shade val="78000"/>
               </a:schemeClr>
             </a:gs>
           </a:gsLst>
-          <a:lin ang="16200000" scaled="0"/>
+          <a:lin ang="5400000" scaled="0"/>
         </a:gradFill>
       </a:fillStyleLst>
       <a:lnStyleLst>
-        <a:ln w="9525" cap="flat" cmpd="sng" algn="ctr">
-          <a:solidFill>
-            <a:schemeClr val="phClr">
-              <a:shade val="95000"/>
-              <a:satMod val="105000"/>
-            </a:schemeClr>
-          </a:solidFill>
-          <a:prstDash val="solid"/>
-        </a:ln>
-        <a:ln w="25400" cap="flat" cmpd="sng" algn="ctr">
+        <a:ln w="6350" cap="flat" cmpd="sng" algn="ctr">
           <a:solidFill>
             <a:schemeClr val="phClr"/>
           </a:solidFill>
           <a:prstDash val="solid"/>
+          <a:miter lim="800000"/>
         </a:ln>
-        <a:ln w="38100" cap="flat" cmpd="sng" algn="ctr">
+        <a:ln w="12700" cap="flat" cmpd="sng" algn="ctr">
           <a:solidFill>
             <a:schemeClr val="phClr"/>
           </a:solidFill>
           <a:prstDash val="solid"/>
+          <a:miter lim="800000"/>
+        </a:ln>
+        <a:ln w="19050" cap="flat" cmpd="sng" algn="ctr">
+          <a:solidFill>
+            <a:schemeClr val="phClr"/>
+          </a:solidFill>
+          <a:prstDash val="solid"/>
+          <a:miter lim="800000"/>
         </a:ln>
       </a:lnStyleLst>
       <a:effectStyleLst>
         <a:effectStyle>
+          <a:effectLst/>
+        </a:effectStyle>
+        <a:effectStyle>
+          <a:effectLst/>
+        </a:effectStyle>
+        <a:effectStyle>
           <a:effectLst>
-            <a:outerShdw blurRad="40000" dist="20000" dir="5400000" rotWithShape="0">
+            <a:outerShdw blurRad="57150" dist="19050" dir="5400000" algn="ctr" rotWithShape="0">
               <a:srgbClr val="000000">
-                <a:alpha val="38000"/>
+                <a:alpha val="63000"/>
               </a:srgbClr>
             </a:outerShdw>
           </a:effectLst>
-        </a:effectStyle>
-        <a:effectStyle>
-          <a:effectLst>
-            <a:outerShdw blurRad="40000" dist="23000" dir="5400000" rotWithShape="0">
-              <a:srgbClr val="000000">
-                <a:alpha val="35000"/>
-              </a:srgbClr>
-            </a:outerShdw>
-          </a:effectLst>
-        </a:effectStyle>
-        <a:effectStyle>
-          <a:effectLst>
-            <a:outerShdw blurRad="40000" dist="23000" dir="5400000" rotWithShape="0">
-              <a:srgbClr val="000000">
-                <a:alpha val="35000"/>
-              </a:srgbClr>
-            </a:outerShdw>
-          </a:effectLst>
-          <a:scene3d>
-            <a:camera prst="orthographicFront">
-              <a:rot lat="0" lon="0" rev="0"/>
-            </a:camera>
-            <a:lightRig rig="threePt" dir="t">
-              <a:rot lat="0" lon="0" rev="1200000"/>
-            </a:lightRig>
-          </a:scene3d>
-          <a:sp3d>
-            <a:bevelT w="63500" h="25400"/>
-          </a:sp3d>
         </a:effectStyle>
       </a:effectStyleLst>
       <a:bgFillStyleLst>
         <a:solidFill>
           <a:schemeClr val="phClr"/>
         </a:solidFill>
+        <a:solidFill>
+          <a:schemeClr val="phClr">
+            <a:tint val="95000"/>
+            <a:satMod val="170000"/>
+          </a:schemeClr>
+        </a:solidFill>
         <a:gradFill rotWithShape="1">
           <a:gsLst>
             <a:gs pos="0">
               <a:schemeClr val="phClr">
-                <a:tint val="40000"/>
-                <a:satMod val="350000"/>
+                <a:tint val="93000"/>
+                <a:satMod val="150000"/>
+                <a:shade val="98000"/>
+                <a:lumMod val="102000"/>
               </a:schemeClr>
             </a:gs>
-            <a:gs pos="40000">
+            <a:gs pos="50000">
               <a:schemeClr val="phClr">
-                <a:tint val="45000"/>
-                <a:shade val="99000"/>
-                <a:satMod val="350000"/>
+                <a:tint val="98000"/>
+                <a:satMod val="130000"/>
+                <a:shade val="90000"/>
+                <a:lumMod val="103000"/>
               </a:schemeClr>
             </a:gs>
             <a:gs pos="100000">
               <a:schemeClr val="phClr">
-                <a:shade val="20000"/>
-                <a:satMod val="255000"/>
+                <a:shade val="63000"/>
+                <a:satMod val="120000"/>
               </a:schemeClr>
             </a:gs>
           </a:gsLst>
-          <a:path path="circle">
-            <a:fillToRect l="50000" t="-80000" r="50000" b="180000"/>
-          </a:path>
-        </a:gradFill>
-        <a:gradFill rotWithShape="1">
-          <a:gsLst>
-            <a:gs pos="0">
-              <a:schemeClr val="phClr">
-                <a:tint val="80000"/>
-                <a:satMod val="300000"/>
-              </a:schemeClr>
-            </a:gs>
-            <a:gs pos="100000">
-              <a:schemeClr val="phClr">
-                <a:shade val="30000"/>
-                <a:satMod val="200000"/>
-              </a:schemeClr>
-            </a:gs>
-          </a:gsLst>
-          <a:path path="circle">
-            <a:fillToRect l="50000" t="50000" r="50000" b="50000"/>
-          </a:path>
+          <a:lin ang="5400000" scaled="0"/>
         </a:gradFill>
       </a:bgFillStyleLst>
     </a:fmtScheme>
   </a:themeElements>
-  <a:objectDefaults>
-    <a:spDef>
-      <a:spPr/>
-      <a:bodyPr/>
-      <a:lstStyle/>
-      <a:style>
-        <a:lnRef idx="1">
-          <a:schemeClr val="accent1"/>
-        </a:lnRef>
-        <a:fillRef idx="3">
-          <a:schemeClr val="accent1"/>
-        </a:fillRef>
-        <a:effectRef idx="2">
-          <a:schemeClr val="accent1"/>
-        </a:effectRef>
-        <a:fontRef idx="minor">
-          <a:schemeClr val="lt1"/>
-        </a:fontRef>
-      </a:style>
-    </a:spDef>
-    <a:lnDef>
-      <a:spPr/>
-      <a:bodyPr/>
-      <a:lstStyle/>
-      <a:style>
-        <a:lnRef idx="2">
-          <a:schemeClr val="accent1"/>
-        </a:lnRef>
-        <a:fillRef idx="0">
-          <a:schemeClr val="accent1"/>
-        </a:fillRef>
-        <a:effectRef idx="1">
-          <a:schemeClr val="accent1"/>
-        </a:effectRef>
-        <a:fontRef idx="minor">
-          <a:schemeClr val="tx1"/>
-        </a:fontRef>
-      </a:style>
-    </a:lnDef>
-  </a:objectDefaults>
+  <a:objectDefaults/>
   <a:extraClrSchemeLst/>
+  <a:extLst>
+    <a:ext uri="{05A4C25C-085E-4340-85A3-A5531E510DB2}">
+      <thm15:themeFamily xmlns:thm15="http://schemas.microsoft.com/office/thememl/2012/main" name="Office Theme" id="{2E142A2C-CD16-42D6-873A-C26D2A0506FA}" vid="{1BDDFF52-6CD6-40A5-AB3C-68EB2F1E4D0A}"/>
+    </a:ext>
+  </a:extLst>
 </a:theme>
 </file>
</xml_diff>